<commit_message>
upload on july 6 before class
</commit_message>
<xml_diff>
--- a/DI_Bootcamp_Stage1/04_full_stack_coding_bootcamp/week_11_adv_and_asynchronous_javascript/day_1_2_HTTP_and_form_method_GET_and_POST/0_course/HTTP + GET_POST.docx
+++ b/DI_Bootcamp_Stage1/04_full_stack_coding_bootcamp/week_11_adv_and_asynchronous_javascript/day_1_2_HTTP_and_form_method_GET_and_POST/0_course/HTTP + GET_POST.docx
@@ -4,6 +4,21 @@
   <w:body>
     <w:p>
       <w:pPr>
+        <w:pStyle w:val="Titre1"/>
+      </w:pPr>
+      <w:bookmarkStart w:id="0" w:name="_GoBack"/>
+      <w:bookmarkEnd w:id="0"/>
+      <w:r>
+        <w:rPr>
+          <w:rStyle w:val="lev"/>
+          <w:b w:val="0"/>
+          <w:bCs w:val="0"/>
+        </w:rPr>
+        <w:t>HTTP</w:t>
+      </w:r>
+    </w:p>
+    <w:p>
+      <w:pPr>
         <w:pStyle w:val="NormalWeb"/>
       </w:pPr>
       <w:r>
@@ -176,19 +191,11 @@
         </w:numPr>
         <w:ind w:left="1440" w:hanging="360"/>
       </w:pPr>
-      <w:proofErr w:type="spellStart"/>
       <w:r>
         <w:rPr>
           <w:rStyle w:val="lev"/>
         </w:rPr>
-        <w:t>Status</w:t>
-      </w:r>
-      <w:proofErr w:type="spellEnd"/>
-      <w:r>
-        <w:rPr>
-          <w:rStyle w:val="lev"/>
-        </w:rPr>
-        <w:t xml:space="preserve"> line</w:t>
+        <w:t>Status line</w:t>
       </w:r>
       <w:r>
         <w:t xml:space="preserve"> : version HTTP, code de statut (200, 404, 500…) et message associé.</w:t>
@@ -392,15 +399,3096 @@
     </w:p>
     <w:p>
       <w:pPr>
+        <w:pStyle w:val="Titre1"/>
+        <w:rPr>
+          <w:rFonts w:ascii="Times New Roman" w:eastAsia="Times New Roman" w:hAnsi="Times New Roman" w:cs="Times New Roman"/>
+          <w:sz w:val="24"/>
+          <w:szCs w:val="24"/>
+          <w:lang w:eastAsia="fr-FR"/>
+        </w:rPr>
+      </w:pPr>
+      <w:r>
+        <w:rPr>
+          <w:rStyle w:val="lev"/>
+        </w:rPr>
+        <w:t>JSON</w:t>
+      </w:r>
+    </w:p>
+    <w:p>
+      <w:pPr>
+        <w:spacing w:before="100" w:beforeAutospacing="1" w:after="100" w:afterAutospacing="1" w:line="240" w:lineRule="auto"/>
+        <w:rPr>
+          <w:rFonts w:ascii="Times New Roman" w:eastAsia="Times New Roman" w:hAnsi="Times New Roman" w:cs="Times New Roman"/>
+          <w:sz w:val="24"/>
+          <w:szCs w:val="24"/>
+          <w:lang w:eastAsia="fr-FR"/>
+        </w:rPr>
+      </w:pPr>
+      <w:r>
+        <w:rPr>
+          <w:rFonts w:ascii="Times New Roman" w:eastAsia="Times New Roman" w:hAnsi="Times New Roman" w:cs="Times New Roman"/>
+          <w:sz w:val="24"/>
+          <w:szCs w:val="24"/>
+          <w:lang w:eastAsia="fr-FR"/>
+        </w:rPr>
+        <w:t>Voici un résumé simple et direct :</w:t>
+      </w:r>
+    </w:p>
+    <w:p>
+      <w:pPr>
+        <w:numPr>
+          <w:ilvl w:val="0"/>
+          <w:numId w:val="4"/>
+        </w:numPr>
+        <w:spacing w:before="100" w:beforeAutospacing="1" w:after="100" w:afterAutospacing="1" w:line="240" w:lineRule="auto"/>
+        <w:rPr>
+          <w:rFonts w:ascii="Times New Roman" w:eastAsia="Times New Roman" w:hAnsi="Times New Roman" w:cs="Times New Roman"/>
+          <w:sz w:val="24"/>
+          <w:szCs w:val="24"/>
+          <w:lang w:eastAsia="fr-FR"/>
+        </w:rPr>
+      </w:pPr>
+      <w:r>
+        <w:rPr>
+          <w:rFonts w:ascii="Times New Roman" w:eastAsia="Times New Roman" w:hAnsi="Times New Roman" w:cs="Times New Roman"/>
+          <w:b/>
+          <w:bCs/>
+          <w:sz w:val="24"/>
+          <w:szCs w:val="24"/>
+          <w:lang w:eastAsia="fr-FR"/>
+        </w:rPr>
+        <w:t>Qu’est-ce que JSON ?</w:t>
+      </w:r>
+      <w:r>
+        <w:rPr>
+          <w:rFonts w:ascii="Times New Roman" w:eastAsia="Times New Roman" w:hAnsi="Times New Roman" w:cs="Times New Roman"/>
+          <w:sz w:val="24"/>
+          <w:szCs w:val="24"/>
+          <w:lang w:eastAsia="fr-FR"/>
+        </w:rPr>
+        <w:br/>
+        <w:t xml:space="preserve">JavaScript Object Notation est un format léger d’échange de données, facile à lire et écrire pour les humains, et facile à </w:t>
+      </w:r>
+      <w:proofErr w:type="spellStart"/>
+      <w:r>
+        <w:rPr>
+          <w:rFonts w:ascii="Times New Roman" w:eastAsia="Times New Roman" w:hAnsi="Times New Roman" w:cs="Times New Roman"/>
+          <w:sz w:val="24"/>
+          <w:szCs w:val="24"/>
+          <w:lang w:eastAsia="fr-FR"/>
+        </w:rPr>
+        <w:t>parser</w:t>
+      </w:r>
+      <w:proofErr w:type="spellEnd"/>
+      <w:r>
+        <w:rPr>
+          <w:rFonts w:ascii="Times New Roman" w:eastAsia="Times New Roman" w:hAnsi="Times New Roman" w:cs="Times New Roman"/>
+          <w:sz w:val="24"/>
+          <w:szCs w:val="24"/>
+          <w:lang w:eastAsia="fr-FR"/>
+        </w:rPr>
+        <w:t xml:space="preserve"> pour les machines.</w:t>
+      </w:r>
+    </w:p>
+    <w:p>
+      <w:pPr>
+        <w:numPr>
+          <w:ilvl w:val="0"/>
+          <w:numId w:val="4"/>
+        </w:numPr>
+        <w:spacing w:before="100" w:beforeAutospacing="1" w:after="100" w:afterAutospacing="1" w:line="240" w:lineRule="auto"/>
+        <w:rPr>
+          <w:rFonts w:ascii="Times New Roman" w:eastAsia="Times New Roman" w:hAnsi="Times New Roman" w:cs="Times New Roman"/>
+          <w:sz w:val="24"/>
+          <w:szCs w:val="24"/>
+          <w:lang w:eastAsia="fr-FR"/>
+        </w:rPr>
+      </w:pPr>
+      <w:r>
+        <w:rPr>
+          <w:rFonts w:ascii="Times New Roman" w:eastAsia="Times New Roman" w:hAnsi="Times New Roman" w:cs="Times New Roman"/>
+          <w:b/>
+          <w:bCs/>
+          <w:sz w:val="24"/>
+          <w:szCs w:val="24"/>
+          <w:lang w:eastAsia="fr-FR"/>
+        </w:rPr>
+        <w:t>Méthodes JavaScript pour manipuler le JSON</w:t>
+      </w:r>
+    </w:p>
+    <w:p>
+      <w:pPr>
+        <w:numPr>
+          <w:ilvl w:val="1"/>
+          <w:numId w:val="4"/>
+        </w:numPr>
+        <w:spacing w:before="100" w:beforeAutospacing="1" w:after="100" w:afterAutospacing="1" w:line="240" w:lineRule="auto"/>
+        <w:rPr>
+          <w:rFonts w:ascii="Times New Roman" w:eastAsia="Times New Roman" w:hAnsi="Times New Roman" w:cs="Times New Roman"/>
+          <w:sz w:val="24"/>
+          <w:szCs w:val="24"/>
+          <w:lang w:eastAsia="fr-FR"/>
+        </w:rPr>
+      </w:pPr>
+      <w:proofErr w:type="spellStart"/>
+      <w:r>
+        <w:rPr>
+          <w:rFonts w:ascii="Courier New" w:eastAsia="Times New Roman" w:hAnsi="Courier New" w:cs="Courier New"/>
+          <w:b/>
+          <w:bCs/>
+          <w:sz w:val="20"/>
+          <w:szCs w:val="20"/>
+          <w:lang w:eastAsia="fr-FR"/>
+        </w:rPr>
+        <w:t>JSON.stringify</w:t>
+      </w:r>
+      <w:proofErr w:type="spellEnd"/>
+      <w:r>
+        <w:rPr>
+          <w:rFonts w:ascii="Times New Roman" w:eastAsia="Times New Roman" w:hAnsi="Times New Roman" w:cs="Times New Roman"/>
+          <w:sz w:val="24"/>
+          <w:szCs w:val="24"/>
+          <w:lang w:eastAsia="fr-FR"/>
+        </w:rPr>
+        <w:t xml:space="preserve"> : transforme un objet JavaScript en chaîne JSON.</w:t>
+      </w:r>
+    </w:p>
+    <w:p>
+      <w:pPr>
+        <w:numPr>
+          <w:ilvl w:val="1"/>
+          <w:numId w:val="4"/>
+        </w:numPr>
+        <w:spacing w:before="100" w:beforeAutospacing="1" w:after="100" w:afterAutospacing="1" w:line="240" w:lineRule="auto"/>
+        <w:rPr>
+          <w:rFonts w:ascii="Times New Roman" w:eastAsia="Times New Roman" w:hAnsi="Times New Roman" w:cs="Times New Roman"/>
+          <w:sz w:val="24"/>
+          <w:szCs w:val="24"/>
+          <w:lang w:eastAsia="fr-FR"/>
+        </w:rPr>
+      </w:pPr>
+      <w:proofErr w:type="spellStart"/>
+      <w:r>
+        <w:rPr>
+          <w:rFonts w:ascii="Times New Roman" w:eastAsia="Times New Roman" w:hAnsi="Times New Roman" w:cs="Times New Roman"/>
+          <w:b/>
+          <w:bCs/>
+          <w:sz w:val="24"/>
+          <w:szCs w:val="24"/>
+          <w:lang w:eastAsia="fr-FR"/>
+        </w:rPr>
+        <w:t>Pretty</w:t>
+      </w:r>
+      <w:proofErr w:type="spellEnd"/>
+      <w:r>
+        <w:rPr>
+          <w:rFonts w:ascii="Times New Roman" w:eastAsia="Times New Roman" w:hAnsi="Times New Roman" w:cs="Times New Roman"/>
+          <w:b/>
+          <w:bCs/>
+          <w:sz w:val="24"/>
+          <w:szCs w:val="24"/>
+          <w:lang w:eastAsia="fr-FR"/>
+        </w:rPr>
+        <w:t xml:space="preserve"> </w:t>
+      </w:r>
+      <w:proofErr w:type="spellStart"/>
+      <w:r>
+        <w:rPr>
+          <w:rFonts w:ascii="Times New Roman" w:eastAsia="Times New Roman" w:hAnsi="Times New Roman" w:cs="Times New Roman"/>
+          <w:b/>
+          <w:bCs/>
+          <w:sz w:val="24"/>
+          <w:szCs w:val="24"/>
+          <w:lang w:eastAsia="fr-FR"/>
+        </w:rPr>
+        <w:t>print</w:t>
+      </w:r>
+      <w:proofErr w:type="spellEnd"/>
+      <w:r>
+        <w:rPr>
+          <w:rFonts w:ascii="Times New Roman" w:eastAsia="Times New Roman" w:hAnsi="Times New Roman" w:cs="Times New Roman"/>
+          <w:b/>
+          <w:bCs/>
+          <w:sz w:val="24"/>
+          <w:szCs w:val="24"/>
+          <w:lang w:eastAsia="fr-FR"/>
+        </w:rPr>
+        <w:t xml:space="preserve"> JSON string</w:t>
+      </w:r>
+      <w:r>
+        <w:rPr>
+          <w:rFonts w:ascii="Times New Roman" w:eastAsia="Times New Roman" w:hAnsi="Times New Roman" w:cs="Times New Roman"/>
+          <w:sz w:val="24"/>
+          <w:szCs w:val="24"/>
+          <w:lang w:eastAsia="fr-FR"/>
+        </w:rPr>
+        <w:t xml:space="preserve"> : appeler </w:t>
+      </w:r>
+      <w:proofErr w:type="spellStart"/>
+      <w:r>
+        <w:rPr>
+          <w:rFonts w:ascii="Courier New" w:eastAsia="Times New Roman" w:hAnsi="Courier New" w:cs="Courier New"/>
+          <w:sz w:val="20"/>
+          <w:szCs w:val="20"/>
+          <w:lang w:eastAsia="fr-FR"/>
+        </w:rPr>
+        <w:t>JSON.stringify</w:t>
+      </w:r>
+      <w:proofErr w:type="spellEnd"/>
+      <w:r>
+        <w:rPr>
+          <w:rFonts w:ascii="Courier New" w:eastAsia="Times New Roman" w:hAnsi="Courier New" w:cs="Courier New"/>
+          <w:sz w:val="20"/>
+          <w:szCs w:val="20"/>
+          <w:lang w:eastAsia="fr-FR"/>
+        </w:rPr>
+        <w:t>(</w:t>
+      </w:r>
+      <w:proofErr w:type="spellStart"/>
+      <w:r>
+        <w:rPr>
+          <w:rFonts w:ascii="Courier New" w:eastAsia="Times New Roman" w:hAnsi="Courier New" w:cs="Courier New"/>
+          <w:sz w:val="20"/>
+          <w:szCs w:val="20"/>
+          <w:lang w:eastAsia="fr-FR"/>
+        </w:rPr>
+        <w:t>obj</w:t>
+      </w:r>
+      <w:proofErr w:type="spellEnd"/>
+      <w:r>
+        <w:rPr>
+          <w:rFonts w:ascii="Courier New" w:eastAsia="Times New Roman" w:hAnsi="Courier New" w:cs="Courier New"/>
+          <w:sz w:val="20"/>
+          <w:szCs w:val="20"/>
+          <w:lang w:eastAsia="fr-FR"/>
+        </w:rPr>
+        <w:t xml:space="preserve">, </w:t>
+      </w:r>
+      <w:proofErr w:type="spellStart"/>
+      <w:r>
+        <w:rPr>
+          <w:rFonts w:ascii="Courier New" w:eastAsia="Times New Roman" w:hAnsi="Courier New" w:cs="Courier New"/>
+          <w:sz w:val="20"/>
+          <w:szCs w:val="20"/>
+          <w:lang w:eastAsia="fr-FR"/>
+        </w:rPr>
+        <w:t>null</w:t>
+      </w:r>
+      <w:proofErr w:type="spellEnd"/>
+      <w:r>
+        <w:rPr>
+          <w:rFonts w:ascii="Courier New" w:eastAsia="Times New Roman" w:hAnsi="Courier New" w:cs="Courier New"/>
+          <w:sz w:val="20"/>
+          <w:szCs w:val="20"/>
+          <w:lang w:eastAsia="fr-FR"/>
+        </w:rPr>
+        <w:t>, 2)</w:t>
+      </w:r>
+      <w:r>
+        <w:rPr>
+          <w:rFonts w:ascii="Times New Roman" w:eastAsia="Times New Roman" w:hAnsi="Times New Roman" w:cs="Times New Roman"/>
+          <w:sz w:val="24"/>
+          <w:szCs w:val="24"/>
+          <w:lang w:eastAsia="fr-FR"/>
+        </w:rPr>
+        <w:t xml:space="preserve"> pour indenter joliment (2 espaces) la chaîne JSON.</w:t>
+      </w:r>
+    </w:p>
+    <w:p>
+      <w:pPr>
+        <w:numPr>
+          <w:ilvl w:val="1"/>
+          <w:numId w:val="4"/>
+        </w:numPr>
+        <w:spacing w:before="100" w:beforeAutospacing="1" w:after="100" w:afterAutospacing="1" w:line="240" w:lineRule="auto"/>
+        <w:rPr>
+          <w:rFonts w:ascii="Times New Roman" w:eastAsia="Times New Roman" w:hAnsi="Times New Roman" w:cs="Times New Roman"/>
+          <w:sz w:val="24"/>
+          <w:szCs w:val="24"/>
+          <w:lang w:eastAsia="fr-FR"/>
+        </w:rPr>
+      </w:pPr>
+      <w:r>
+        <w:rPr>
+          <w:rFonts w:ascii="Times New Roman" w:eastAsia="Times New Roman" w:hAnsi="Times New Roman" w:cs="Times New Roman"/>
+          <w:b/>
+          <w:bCs/>
+          <w:sz w:val="24"/>
+          <w:szCs w:val="24"/>
+          <w:lang w:eastAsia="fr-FR"/>
+        </w:rPr>
+        <w:t>Différence entre objet JSON-encodé et littéral</w:t>
+      </w:r>
+      <w:r>
+        <w:rPr>
+          <w:rFonts w:ascii="Times New Roman" w:eastAsia="Times New Roman" w:hAnsi="Times New Roman" w:cs="Times New Roman"/>
+          <w:sz w:val="24"/>
+          <w:szCs w:val="24"/>
+          <w:lang w:eastAsia="fr-FR"/>
+        </w:rPr>
+        <w:t xml:space="preserve"> :</w:t>
+      </w:r>
+    </w:p>
+    <w:p>
+      <w:pPr>
+        <w:numPr>
+          <w:ilvl w:val="2"/>
+          <w:numId w:val="4"/>
+        </w:numPr>
+        <w:spacing w:before="100" w:beforeAutospacing="1" w:after="100" w:afterAutospacing="1" w:line="240" w:lineRule="auto"/>
+        <w:rPr>
+          <w:rFonts w:ascii="Times New Roman" w:eastAsia="Times New Roman" w:hAnsi="Times New Roman" w:cs="Times New Roman"/>
+          <w:sz w:val="24"/>
+          <w:szCs w:val="24"/>
+          <w:lang w:eastAsia="fr-FR"/>
+        </w:rPr>
+      </w:pPr>
+      <w:r>
+        <w:rPr>
+          <w:rFonts w:ascii="Times New Roman" w:eastAsia="Times New Roman" w:hAnsi="Times New Roman" w:cs="Times New Roman"/>
+          <w:sz w:val="24"/>
+          <w:szCs w:val="24"/>
+          <w:lang w:eastAsia="fr-FR"/>
+        </w:rPr>
+        <w:lastRenderedPageBreak/>
+        <w:t xml:space="preserve">Objet littéral : </w:t>
+      </w:r>
+      <w:proofErr w:type="gramStart"/>
+      <w:r>
+        <w:rPr>
+          <w:rFonts w:ascii="Courier New" w:eastAsia="Times New Roman" w:hAnsi="Courier New" w:cs="Courier New"/>
+          <w:sz w:val="20"/>
+          <w:szCs w:val="20"/>
+          <w:lang w:eastAsia="fr-FR"/>
+        </w:rPr>
+        <w:t xml:space="preserve">{ </w:t>
+      </w:r>
+      <w:proofErr w:type="spellStart"/>
+      <w:r>
+        <w:rPr>
+          <w:rFonts w:ascii="Courier New" w:eastAsia="Times New Roman" w:hAnsi="Courier New" w:cs="Courier New"/>
+          <w:sz w:val="20"/>
+          <w:szCs w:val="20"/>
+          <w:lang w:eastAsia="fr-FR"/>
+        </w:rPr>
+        <w:t>name</w:t>
+      </w:r>
+      <w:proofErr w:type="spellEnd"/>
+      <w:proofErr w:type="gramEnd"/>
+      <w:r>
+        <w:rPr>
+          <w:rFonts w:ascii="Courier New" w:eastAsia="Times New Roman" w:hAnsi="Courier New" w:cs="Courier New"/>
+          <w:sz w:val="20"/>
+          <w:szCs w:val="20"/>
+          <w:lang w:eastAsia="fr-FR"/>
+        </w:rPr>
+        <w:t xml:space="preserve">: "Anna", </w:t>
+      </w:r>
+      <w:proofErr w:type="spellStart"/>
+      <w:r>
+        <w:rPr>
+          <w:rFonts w:ascii="Courier New" w:eastAsia="Times New Roman" w:hAnsi="Courier New" w:cs="Courier New"/>
+          <w:sz w:val="20"/>
+          <w:szCs w:val="20"/>
+          <w:lang w:eastAsia="fr-FR"/>
+        </w:rPr>
+        <w:t>age</w:t>
+      </w:r>
+      <w:proofErr w:type="spellEnd"/>
+      <w:r>
+        <w:rPr>
+          <w:rFonts w:ascii="Courier New" w:eastAsia="Times New Roman" w:hAnsi="Courier New" w:cs="Courier New"/>
+          <w:sz w:val="20"/>
+          <w:szCs w:val="20"/>
+          <w:lang w:eastAsia="fr-FR"/>
+        </w:rPr>
+        <w:t>: 30 }</w:t>
+      </w:r>
+    </w:p>
+    <w:p>
+      <w:pPr>
+        <w:numPr>
+          <w:ilvl w:val="2"/>
+          <w:numId w:val="4"/>
+        </w:numPr>
+        <w:spacing w:before="100" w:beforeAutospacing="1" w:after="100" w:afterAutospacing="1" w:line="240" w:lineRule="auto"/>
+        <w:rPr>
+          <w:rFonts w:ascii="Times New Roman" w:eastAsia="Times New Roman" w:hAnsi="Times New Roman" w:cs="Times New Roman"/>
+          <w:sz w:val="24"/>
+          <w:szCs w:val="24"/>
+          <w:lang w:eastAsia="fr-FR"/>
+        </w:rPr>
+      </w:pPr>
+      <w:r>
+        <w:rPr>
+          <w:rFonts w:ascii="Times New Roman" w:eastAsia="Times New Roman" w:hAnsi="Times New Roman" w:cs="Times New Roman"/>
+          <w:sz w:val="24"/>
+          <w:szCs w:val="24"/>
+          <w:lang w:eastAsia="fr-FR"/>
+        </w:rPr>
+        <w:t xml:space="preserve">Chaîne JSON : </w:t>
+      </w:r>
+      <w:r>
+        <w:rPr>
+          <w:rFonts w:ascii="Courier New" w:eastAsia="Times New Roman" w:hAnsi="Courier New" w:cs="Courier New"/>
+          <w:sz w:val="20"/>
+          <w:szCs w:val="20"/>
+          <w:lang w:eastAsia="fr-FR"/>
+        </w:rPr>
+        <w:t>"{"name":"Anna","age":30}"</w:t>
+      </w:r>
+      <w:r>
+        <w:rPr>
+          <w:rFonts w:ascii="Times New Roman" w:eastAsia="Times New Roman" w:hAnsi="Times New Roman" w:cs="Times New Roman"/>
+          <w:sz w:val="24"/>
+          <w:szCs w:val="24"/>
+          <w:lang w:eastAsia="fr-FR"/>
+        </w:rPr>
+        <w:t xml:space="preserve"> (tout est entre guillemets, clés et valeurs conformes au standard JSON).</w:t>
+      </w:r>
+    </w:p>
+    <w:p>
+      <w:pPr>
+        <w:numPr>
+          <w:ilvl w:val="1"/>
+          <w:numId w:val="4"/>
+        </w:numPr>
+        <w:spacing w:before="100" w:beforeAutospacing="1" w:after="100" w:afterAutospacing="1" w:line="240" w:lineRule="auto"/>
+        <w:rPr>
+          <w:rFonts w:ascii="Times New Roman" w:eastAsia="Times New Roman" w:hAnsi="Times New Roman" w:cs="Times New Roman"/>
+          <w:sz w:val="24"/>
+          <w:szCs w:val="24"/>
+          <w:lang w:eastAsia="fr-FR"/>
+        </w:rPr>
+      </w:pPr>
+      <w:r>
+        <w:rPr>
+          <w:rFonts w:ascii="Times New Roman" w:eastAsia="Times New Roman" w:hAnsi="Times New Roman" w:cs="Times New Roman"/>
+          <w:b/>
+          <w:bCs/>
+          <w:sz w:val="24"/>
+          <w:szCs w:val="24"/>
+          <w:lang w:eastAsia="fr-FR"/>
+        </w:rPr>
+        <w:t>Types de données supportés</w:t>
+      </w:r>
+      <w:r>
+        <w:rPr>
+          <w:rFonts w:ascii="Times New Roman" w:eastAsia="Times New Roman" w:hAnsi="Times New Roman" w:cs="Times New Roman"/>
+          <w:sz w:val="24"/>
+          <w:szCs w:val="24"/>
+          <w:lang w:eastAsia="fr-FR"/>
+        </w:rPr>
+        <w:t xml:space="preserve"> : chaînes (</w:t>
+      </w:r>
+      <w:r>
+        <w:rPr>
+          <w:rFonts w:ascii="Courier New" w:eastAsia="Times New Roman" w:hAnsi="Courier New" w:cs="Courier New"/>
+          <w:sz w:val="20"/>
+          <w:szCs w:val="20"/>
+          <w:lang w:eastAsia="fr-FR"/>
+        </w:rPr>
+        <w:t>"texte"</w:t>
+      </w:r>
+      <w:r>
+        <w:rPr>
+          <w:rFonts w:ascii="Times New Roman" w:eastAsia="Times New Roman" w:hAnsi="Times New Roman" w:cs="Times New Roman"/>
+          <w:sz w:val="24"/>
+          <w:szCs w:val="24"/>
+          <w:lang w:eastAsia="fr-FR"/>
+        </w:rPr>
+        <w:t>), nombres (</w:t>
+      </w:r>
+      <w:r>
+        <w:rPr>
+          <w:rFonts w:ascii="Courier New" w:eastAsia="Times New Roman" w:hAnsi="Courier New" w:cs="Courier New"/>
+          <w:sz w:val="20"/>
+          <w:szCs w:val="20"/>
+          <w:lang w:eastAsia="fr-FR"/>
+        </w:rPr>
+        <w:t>42</w:t>
+      </w:r>
+      <w:r>
+        <w:rPr>
+          <w:rFonts w:ascii="Times New Roman" w:eastAsia="Times New Roman" w:hAnsi="Times New Roman" w:cs="Times New Roman"/>
+          <w:sz w:val="24"/>
+          <w:szCs w:val="24"/>
+          <w:lang w:eastAsia="fr-FR"/>
+        </w:rPr>
+        <w:t>), booléens (</w:t>
+      </w:r>
+      <w:proofErr w:type="spellStart"/>
+      <w:r>
+        <w:rPr>
+          <w:rFonts w:ascii="Courier New" w:eastAsia="Times New Roman" w:hAnsi="Courier New" w:cs="Courier New"/>
+          <w:sz w:val="20"/>
+          <w:szCs w:val="20"/>
+          <w:lang w:eastAsia="fr-FR"/>
+        </w:rPr>
+        <w:t>true</w:t>
+      </w:r>
+      <w:proofErr w:type="spellEnd"/>
+      <w:r>
+        <w:rPr>
+          <w:rFonts w:ascii="Times New Roman" w:eastAsia="Times New Roman" w:hAnsi="Times New Roman" w:cs="Times New Roman"/>
+          <w:sz w:val="24"/>
+          <w:szCs w:val="24"/>
+          <w:lang w:eastAsia="fr-FR"/>
+        </w:rPr>
+        <w:t>/</w:t>
+      </w:r>
+      <w:r>
+        <w:rPr>
+          <w:rFonts w:ascii="Courier New" w:eastAsia="Times New Roman" w:hAnsi="Courier New" w:cs="Courier New"/>
+          <w:sz w:val="20"/>
+          <w:szCs w:val="20"/>
+          <w:lang w:eastAsia="fr-FR"/>
+        </w:rPr>
+        <w:t>false</w:t>
+      </w:r>
+      <w:r>
+        <w:rPr>
+          <w:rFonts w:ascii="Times New Roman" w:eastAsia="Times New Roman" w:hAnsi="Times New Roman" w:cs="Times New Roman"/>
+          <w:sz w:val="24"/>
+          <w:szCs w:val="24"/>
+          <w:lang w:eastAsia="fr-FR"/>
+        </w:rPr>
+        <w:t xml:space="preserve">), </w:t>
+      </w:r>
+      <w:proofErr w:type="spellStart"/>
+      <w:r>
+        <w:rPr>
+          <w:rFonts w:ascii="Courier New" w:eastAsia="Times New Roman" w:hAnsi="Courier New" w:cs="Courier New"/>
+          <w:sz w:val="20"/>
+          <w:szCs w:val="20"/>
+          <w:lang w:eastAsia="fr-FR"/>
+        </w:rPr>
+        <w:t>null</w:t>
+      </w:r>
+      <w:proofErr w:type="spellEnd"/>
+      <w:r>
+        <w:rPr>
+          <w:rFonts w:ascii="Times New Roman" w:eastAsia="Times New Roman" w:hAnsi="Times New Roman" w:cs="Times New Roman"/>
+          <w:sz w:val="24"/>
+          <w:szCs w:val="24"/>
+          <w:lang w:eastAsia="fr-FR"/>
+        </w:rPr>
+        <w:t>, tableaux (</w:t>
+      </w:r>
+      <w:r>
+        <w:rPr>
+          <w:rFonts w:ascii="Courier New" w:eastAsia="Times New Roman" w:hAnsi="Courier New" w:cs="Courier New"/>
+          <w:sz w:val="20"/>
+          <w:szCs w:val="20"/>
+          <w:lang w:eastAsia="fr-FR"/>
+        </w:rPr>
+        <w:t>[...]</w:t>
+      </w:r>
+      <w:r>
+        <w:rPr>
+          <w:rFonts w:ascii="Times New Roman" w:eastAsia="Times New Roman" w:hAnsi="Times New Roman" w:cs="Times New Roman"/>
+          <w:sz w:val="24"/>
+          <w:szCs w:val="24"/>
+          <w:lang w:eastAsia="fr-FR"/>
+        </w:rPr>
+        <w:t>), objets (</w:t>
+      </w:r>
+      <w:r>
+        <w:rPr>
+          <w:rFonts w:ascii="Courier New" w:eastAsia="Times New Roman" w:hAnsi="Courier New" w:cs="Courier New"/>
+          <w:sz w:val="20"/>
+          <w:szCs w:val="20"/>
+          <w:lang w:eastAsia="fr-FR"/>
+        </w:rPr>
+        <w:t>{...}</w:t>
+      </w:r>
+      <w:r>
+        <w:rPr>
+          <w:rFonts w:ascii="Times New Roman" w:eastAsia="Times New Roman" w:hAnsi="Times New Roman" w:cs="Times New Roman"/>
+          <w:sz w:val="24"/>
+          <w:szCs w:val="24"/>
+          <w:lang w:eastAsia="fr-FR"/>
+        </w:rPr>
+        <w:t>).</w:t>
+      </w:r>
+    </w:p>
+    <w:p>
+      <w:pPr>
+        <w:numPr>
+          <w:ilvl w:val="0"/>
+          <w:numId w:val="4"/>
+        </w:numPr>
+        <w:spacing w:before="100" w:beforeAutospacing="1" w:after="100" w:afterAutospacing="1" w:line="240" w:lineRule="auto"/>
+        <w:rPr>
+          <w:rFonts w:ascii="Times New Roman" w:eastAsia="Times New Roman" w:hAnsi="Times New Roman" w:cs="Times New Roman"/>
+          <w:sz w:val="24"/>
+          <w:szCs w:val="24"/>
+          <w:lang w:eastAsia="fr-FR"/>
+        </w:rPr>
+      </w:pPr>
+      <w:r>
+        <w:rPr>
+          <w:rFonts w:ascii="Times New Roman" w:eastAsia="Times New Roman" w:hAnsi="Times New Roman" w:cs="Times New Roman"/>
+          <w:b/>
+          <w:bCs/>
+          <w:sz w:val="24"/>
+          <w:szCs w:val="24"/>
+          <w:lang w:eastAsia="fr-FR"/>
+        </w:rPr>
+        <w:t>Objet JavaScript imbriqué dans JSON</w:t>
+      </w:r>
+      <w:r>
+        <w:rPr>
+          <w:rFonts w:ascii="Times New Roman" w:eastAsia="Times New Roman" w:hAnsi="Times New Roman" w:cs="Times New Roman"/>
+          <w:sz w:val="24"/>
+          <w:szCs w:val="24"/>
+          <w:lang w:eastAsia="fr-FR"/>
+        </w:rPr>
+        <w:br/>
+        <w:t>Tu peux convertir des structures complexes :</w:t>
+      </w:r>
+    </w:p>
+    <w:p>
+      <w:pPr>
+        <w:numPr>
+          <w:ilvl w:val="0"/>
+          <w:numId w:val="4"/>
+        </w:numPr>
+        <w:tabs>
+          <w:tab w:val="clear" w:pos="720"/>
+          <w:tab w:val="left" w:pos="916"/>
+          <w:tab w:val="left" w:pos="1832"/>
+          <w:tab w:val="left" w:pos="2748"/>
+          <w:tab w:val="left" w:pos="3664"/>
+          <w:tab w:val="left" w:pos="4580"/>
+          <w:tab w:val="left" w:pos="5496"/>
+          <w:tab w:val="left" w:pos="6412"/>
+          <w:tab w:val="left" w:pos="7328"/>
+          <w:tab w:val="left" w:pos="8244"/>
+          <w:tab w:val="left" w:pos="9160"/>
+          <w:tab w:val="left" w:pos="10076"/>
+          <w:tab w:val="left" w:pos="10992"/>
+          <w:tab w:val="left" w:pos="11908"/>
+          <w:tab w:val="left" w:pos="12824"/>
+          <w:tab w:val="left" w:pos="13740"/>
+          <w:tab w:val="left" w:pos="14656"/>
+        </w:tabs>
+        <w:spacing w:after="0" w:line="240" w:lineRule="auto"/>
+        <w:rPr>
+          <w:rFonts w:ascii="Courier New" w:eastAsia="Times New Roman" w:hAnsi="Courier New" w:cs="Courier New"/>
+          <w:sz w:val="20"/>
+          <w:szCs w:val="20"/>
+          <w:lang w:eastAsia="fr-FR"/>
+        </w:rPr>
+      </w:pPr>
+      <w:proofErr w:type="spellStart"/>
+      <w:proofErr w:type="gramStart"/>
+      <w:r>
+        <w:rPr>
+          <w:rFonts w:ascii="Courier New" w:eastAsia="Times New Roman" w:hAnsi="Courier New" w:cs="Courier New"/>
+          <w:sz w:val="20"/>
+          <w:szCs w:val="20"/>
+          <w:lang w:eastAsia="fr-FR"/>
+        </w:rPr>
+        <w:t>const</w:t>
+      </w:r>
+      <w:proofErr w:type="spellEnd"/>
+      <w:proofErr w:type="gramEnd"/>
+      <w:r>
+        <w:rPr>
+          <w:rFonts w:ascii="Courier New" w:eastAsia="Times New Roman" w:hAnsi="Courier New" w:cs="Courier New"/>
+          <w:sz w:val="20"/>
+          <w:szCs w:val="20"/>
+          <w:lang w:eastAsia="fr-FR"/>
+        </w:rPr>
+        <w:t xml:space="preserve"> data = {</w:t>
+      </w:r>
+    </w:p>
+    <w:p>
+      <w:pPr>
+        <w:numPr>
+          <w:ilvl w:val="0"/>
+          <w:numId w:val="4"/>
+        </w:numPr>
+        <w:tabs>
+          <w:tab w:val="clear" w:pos="720"/>
+          <w:tab w:val="left" w:pos="916"/>
+          <w:tab w:val="left" w:pos="1832"/>
+          <w:tab w:val="left" w:pos="2748"/>
+          <w:tab w:val="left" w:pos="3664"/>
+          <w:tab w:val="left" w:pos="4580"/>
+          <w:tab w:val="left" w:pos="5496"/>
+          <w:tab w:val="left" w:pos="6412"/>
+          <w:tab w:val="left" w:pos="7328"/>
+          <w:tab w:val="left" w:pos="8244"/>
+          <w:tab w:val="left" w:pos="9160"/>
+          <w:tab w:val="left" w:pos="10076"/>
+          <w:tab w:val="left" w:pos="10992"/>
+          <w:tab w:val="left" w:pos="11908"/>
+          <w:tab w:val="left" w:pos="12824"/>
+          <w:tab w:val="left" w:pos="13740"/>
+          <w:tab w:val="left" w:pos="14656"/>
+        </w:tabs>
+        <w:spacing w:after="0" w:line="240" w:lineRule="auto"/>
+        <w:rPr>
+          <w:rFonts w:ascii="Courier New" w:eastAsia="Times New Roman" w:hAnsi="Courier New" w:cs="Courier New"/>
+          <w:sz w:val="20"/>
+          <w:szCs w:val="20"/>
+          <w:lang w:val="en-US" w:eastAsia="fr-FR"/>
+        </w:rPr>
+      </w:pPr>
+      <w:r>
+        <w:rPr>
+          <w:rFonts w:ascii="Courier New" w:eastAsia="Times New Roman" w:hAnsi="Courier New" w:cs="Courier New"/>
+          <w:sz w:val="20"/>
+          <w:szCs w:val="20"/>
+          <w:lang w:val="en-US" w:eastAsia="fr-FR"/>
+        </w:rPr>
+        <w:t xml:space="preserve">  user: { name: "Anna", preferences: { theme: "dark" } },</w:t>
+      </w:r>
+    </w:p>
+    <w:p>
+      <w:pPr>
+        <w:numPr>
+          <w:ilvl w:val="0"/>
+          <w:numId w:val="4"/>
+        </w:numPr>
+        <w:tabs>
+          <w:tab w:val="clear" w:pos="720"/>
+          <w:tab w:val="left" w:pos="916"/>
+          <w:tab w:val="left" w:pos="1832"/>
+          <w:tab w:val="left" w:pos="2748"/>
+          <w:tab w:val="left" w:pos="3664"/>
+          <w:tab w:val="left" w:pos="4580"/>
+          <w:tab w:val="left" w:pos="5496"/>
+          <w:tab w:val="left" w:pos="6412"/>
+          <w:tab w:val="left" w:pos="7328"/>
+          <w:tab w:val="left" w:pos="8244"/>
+          <w:tab w:val="left" w:pos="9160"/>
+          <w:tab w:val="left" w:pos="10076"/>
+          <w:tab w:val="left" w:pos="10992"/>
+          <w:tab w:val="left" w:pos="11908"/>
+          <w:tab w:val="left" w:pos="12824"/>
+          <w:tab w:val="left" w:pos="13740"/>
+          <w:tab w:val="left" w:pos="14656"/>
+        </w:tabs>
+        <w:spacing w:after="0" w:line="240" w:lineRule="auto"/>
+        <w:rPr>
+          <w:rFonts w:ascii="Courier New" w:eastAsia="Times New Roman" w:hAnsi="Courier New" w:cs="Courier New"/>
+          <w:sz w:val="20"/>
+          <w:szCs w:val="20"/>
+          <w:lang w:eastAsia="fr-FR"/>
+        </w:rPr>
+      </w:pPr>
+      <w:r>
+        <w:rPr>
+          <w:rFonts w:ascii="Courier New" w:eastAsia="Times New Roman" w:hAnsi="Courier New" w:cs="Courier New"/>
+          <w:sz w:val="20"/>
+          <w:szCs w:val="20"/>
+          <w:lang w:val="en-US" w:eastAsia="fr-FR"/>
+        </w:rPr>
+        <w:t xml:space="preserve">  </w:t>
+      </w:r>
+      <w:proofErr w:type="gramStart"/>
+      <w:r>
+        <w:rPr>
+          <w:rFonts w:ascii="Courier New" w:eastAsia="Times New Roman" w:hAnsi="Courier New" w:cs="Courier New"/>
+          <w:sz w:val="20"/>
+          <w:szCs w:val="20"/>
+          <w:lang w:eastAsia="fr-FR"/>
+        </w:rPr>
+        <w:t>tags</w:t>
+      </w:r>
+      <w:proofErr w:type="gramEnd"/>
+      <w:r>
+        <w:rPr>
+          <w:rFonts w:ascii="Courier New" w:eastAsia="Times New Roman" w:hAnsi="Courier New" w:cs="Courier New"/>
+          <w:sz w:val="20"/>
+          <w:szCs w:val="20"/>
+          <w:lang w:eastAsia="fr-FR"/>
+        </w:rPr>
+        <w:t>: ["code", "JSON"]</w:t>
+      </w:r>
+    </w:p>
+    <w:p>
+      <w:pPr>
+        <w:numPr>
+          <w:ilvl w:val="0"/>
+          <w:numId w:val="4"/>
+        </w:numPr>
+        <w:tabs>
+          <w:tab w:val="clear" w:pos="720"/>
+          <w:tab w:val="left" w:pos="916"/>
+          <w:tab w:val="left" w:pos="1832"/>
+          <w:tab w:val="left" w:pos="2748"/>
+          <w:tab w:val="left" w:pos="3664"/>
+          <w:tab w:val="left" w:pos="4580"/>
+          <w:tab w:val="left" w:pos="5496"/>
+          <w:tab w:val="left" w:pos="6412"/>
+          <w:tab w:val="left" w:pos="7328"/>
+          <w:tab w:val="left" w:pos="8244"/>
+          <w:tab w:val="left" w:pos="9160"/>
+          <w:tab w:val="left" w:pos="10076"/>
+          <w:tab w:val="left" w:pos="10992"/>
+          <w:tab w:val="left" w:pos="11908"/>
+          <w:tab w:val="left" w:pos="12824"/>
+          <w:tab w:val="left" w:pos="13740"/>
+          <w:tab w:val="left" w:pos="14656"/>
+        </w:tabs>
+        <w:spacing w:after="0" w:line="240" w:lineRule="auto"/>
+        <w:rPr>
+          <w:rFonts w:ascii="Courier New" w:eastAsia="Times New Roman" w:hAnsi="Courier New" w:cs="Courier New"/>
+          <w:sz w:val="20"/>
+          <w:szCs w:val="20"/>
+          <w:lang w:eastAsia="fr-FR"/>
+        </w:rPr>
+      </w:pPr>
+      <w:r>
+        <w:rPr>
+          <w:rFonts w:ascii="Courier New" w:eastAsia="Times New Roman" w:hAnsi="Courier New" w:cs="Courier New"/>
+          <w:sz w:val="20"/>
+          <w:szCs w:val="20"/>
+          <w:lang w:eastAsia="fr-FR"/>
+        </w:rPr>
+        <w:t>};</w:t>
+      </w:r>
+    </w:p>
+    <w:p>
+      <w:pPr>
+        <w:numPr>
+          <w:ilvl w:val="0"/>
+          <w:numId w:val="4"/>
+        </w:numPr>
+        <w:tabs>
+          <w:tab w:val="clear" w:pos="720"/>
+          <w:tab w:val="left" w:pos="916"/>
+          <w:tab w:val="left" w:pos="1832"/>
+          <w:tab w:val="left" w:pos="2748"/>
+          <w:tab w:val="left" w:pos="3664"/>
+          <w:tab w:val="left" w:pos="4580"/>
+          <w:tab w:val="left" w:pos="5496"/>
+          <w:tab w:val="left" w:pos="6412"/>
+          <w:tab w:val="left" w:pos="7328"/>
+          <w:tab w:val="left" w:pos="8244"/>
+          <w:tab w:val="left" w:pos="9160"/>
+          <w:tab w:val="left" w:pos="10076"/>
+          <w:tab w:val="left" w:pos="10992"/>
+          <w:tab w:val="left" w:pos="11908"/>
+          <w:tab w:val="left" w:pos="12824"/>
+          <w:tab w:val="left" w:pos="13740"/>
+          <w:tab w:val="left" w:pos="14656"/>
+        </w:tabs>
+        <w:spacing w:after="0" w:line="240" w:lineRule="auto"/>
+        <w:rPr>
+          <w:rFonts w:ascii="Courier New" w:eastAsia="Times New Roman" w:hAnsi="Courier New" w:cs="Courier New"/>
+          <w:sz w:val="20"/>
+          <w:szCs w:val="20"/>
+          <w:lang w:val="en-US" w:eastAsia="fr-FR"/>
+        </w:rPr>
+      </w:pPr>
+      <w:r>
+        <w:rPr>
+          <w:rFonts w:ascii="Courier New" w:eastAsia="Times New Roman" w:hAnsi="Courier New" w:cs="Courier New"/>
+          <w:sz w:val="20"/>
+          <w:szCs w:val="20"/>
+          <w:lang w:val="en-US" w:eastAsia="fr-FR"/>
+        </w:rPr>
+        <w:t xml:space="preserve">const </w:t>
+      </w:r>
+      <w:proofErr w:type="spellStart"/>
+      <w:r>
+        <w:rPr>
+          <w:rFonts w:ascii="Courier New" w:eastAsia="Times New Roman" w:hAnsi="Courier New" w:cs="Courier New"/>
+          <w:sz w:val="20"/>
+          <w:szCs w:val="20"/>
+          <w:lang w:val="en-US" w:eastAsia="fr-FR"/>
+        </w:rPr>
+        <w:t>json</w:t>
+      </w:r>
+      <w:proofErr w:type="spellEnd"/>
+      <w:r>
+        <w:rPr>
+          <w:rFonts w:ascii="Courier New" w:eastAsia="Times New Roman" w:hAnsi="Courier New" w:cs="Courier New"/>
+          <w:sz w:val="20"/>
+          <w:szCs w:val="20"/>
+          <w:lang w:val="en-US" w:eastAsia="fr-FR"/>
+        </w:rPr>
+        <w:t xml:space="preserve"> = </w:t>
+      </w:r>
+      <w:proofErr w:type="spellStart"/>
+      <w:r>
+        <w:rPr>
+          <w:rFonts w:ascii="Courier New" w:eastAsia="Times New Roman" w:hAnsi="Courier New" w:cs="Courier New"/>
+          <w:sz w:val="20"/>
+          <w:szCs w:val="20"/>
+          <w:lang w:val="en-US" w:eastAsia="fr-FR"/>
+        </w:rPr>
+        <w:t>JSON.stringify</w:t>
+      </w:r>
+      <w:proofErr w:type="spellEnd"/>
+      <w:r>
+        <w:rPr>
+          <w:rFonts w:ascii="Courier New" w:eastAsia="Times New Roman" w:hAnsi="Courier New" w:cs="Courier New"/>
+          <w:sz w:val="20"/>
+          <w:szCs w:val="20"/>
+          <w:lang w:val="en-US" w:eastAsia="fr-FR"/>
+        </w:rPr>
+        <w:t>(data);</w:t>
+      </w:r>
+    </w:p>
+    <w:p>
+      <w:pPr>
+        <w:numPr>
+          <w:ilvl w:val="0"/>
+          <w:numId w:val="4"/>
+        </w:numPr>
+        <w:spacing w:before="100" w:beforeAutospacing="1" w:after="100" w:afterAutospacing="1" w:line="240" w:lineRule="auto"/>
+        <w:rPr>
+          <w:rFonts w:ascii="Times New Roman" w:eastAsia="Times New Roman" w:hAnsi="Times New Roman" w:cs="Times New Roman"/>
+          <w:sz w:val="24"/>
+          <w:szCs w:val="24"/>
+          <w:lang w:eastAsia="fr-FR"/>
+        </w:rPr>
+      </w:pPr>
+      <w:r>
+        <w:rPr>
+          <w:rFonts w:ascii="Times New Roman" w:eastAsia="Times New Roman" w:hAnsi="Times New Roman" w:cs="Times New Roman"/>
+          <w:b/>
+          <w:bCs/>
+          <w:sz w:val="24"/>
+          <w:szCs w:val="24"/>
+          <w:lang w:eastAsia="fr-FR"/>
+        </w:rPr>
+        <w:t xml:space="preserve">Méthode </w:t>
+      </w:r>
+      <w:proofErr w:type="spellStart"/>
+      <w:r>
+        <w:rPr>
+          <w:rFonts w:ascii="Courier New" w:eastAsia="Times New Roman" w:hAnsi="Courier New" w:cs="Courier New"/>
+          <w:b/>
+          <w:bCs/>
+          <w:sz w:val="20"/>
+          <w:szCs w:val="20"/>
+          <w:lang w:eastAsia="fr-FR"/>
+        </w:rPr>
+        <w:t>toJSON</w:t>
+      </w:r>
+      <w:proofErr w:type="spellEnd"/>
+      <w:r>
+        <w:rPr>
+          <w:rFonts w:ascii="Times New Roman" w:eastAsia="Times New Roman" w:hAnsi="Times New Roman" w:cs="Times New Roman"/>
+          <w:sz w:val="24"/>
+          <w:szCs w:val="24"/>
+          <w:lang w:eastAsia="fr-FR"/>
+        </w:rPr>
+        <w:br/>
+        <w:t xml:space="preserve">Si un objet possède une méthode </w:t>
+      </w:r>
+      <w:proofErr w:type="spellStart"/>
+      <w:r>
+        <w:rPr>
+          <w:rFonts w:ascii="Courier New" w:eastAsia="Times New Roman" w:hAnsi="Courier New" w:cs="Courier New"/>
+          <w:sz w:val="20"/>
+          <w:szCs w:val="20"/>
+          <w:lang w:eastAsia="fr-FR"/>
+        </w:rPr>
+        <w:t>toJSON</w:t>
+      </w:r>
+      <w:proofErr w:type="spellEnd"/>
+      <w:r>
+        <w:rPr>
+          <w:rFonts w:ascii="Courier New" w:eastAsia="Times New Roman" w:hAnsi="Courier New" w:cs="Courier New"/>
+          <w:sz w:val="20"/>
+          <w:szCs w:val="20"/>
+          <w:lang w:eastAsia="fr-FR"/>
+        </w:rPr>
+        <w:t>()</w:t>
+      </w:r>
+      <w:r>
+        <w:rPr>
+          <w:rFonts w:ascii="Times New Roman" w:eastAsia="Times New Roman" w:hAnsi="Times New Roman" w:cs="Times New Roman"/>
+          <w:sz w:val="24"/>
+          <w:szCs w:val="24"/>
+          <w:lang w:eastAsia="fr-FR"/>
+        </w:rPr>
+        <w:t xml:space="preserve">, </w:t>
+      </w:r>
+      <w:proofErr w:type="spellStart"/>
+      <w:r>
+        <w:rPr>
+          <w:rFonts w:ascii="Courier New" w:eastAsia="Times New Roman" w:hAnsi="Courier New" w:cs="Courier New"/>
+          <w:sz w:val="20"/>
+          <w:szCs w:val="20"/>
+          <w:lang w:eastAsia="fr-FR"/>
+        </w:rPr>
+        <w:t>JSON.stringify</w:t>
+      </w:r>
+      <w:proofErr w:type="spellEnd"/>
+      <w:r>
+        <w:rPr>
+          <w:rFonts w:ascii="Times New Roman" w:eastAsia="Times New Roman" w:hAnsi="Times New Roman" w:cs="Times New Roman"/>
+          <w:sz w:val="24"/>
+          <w:szCs w:val="24"/>
+          <w:lang w:eastAsia="fr-FR"/>
+        </w:rPr>
+        <w:t xml:space="preserve"> l’utilise pour obtenir la représentation JSON personnalisée.</w:t>
+      </w:r>
+    </w:p>
+    <w:p>
+      <w:pPr>
+        <w:numPr>
+          <w:ilvl w:val="0"/>
+          <w:numId w:val="4"/>
+        </w:numPr>
+        <w:tabs>
+          <w:tab w:val="clear" w:pos="720"/>
+          <w:tab w:val="left" w:pos="916"/>
+          <w:tab w:val="left" w:pos="1832"/>
+          <w:tab w:val="left" w:pos="2748"/>
+          <w:tab w:val="left" w:pos="3664"/>
+          <w:tab w:val="left" w:pos="4580"/>
+          <w:tab w:val="left" w:pos="5496"/>
+          <w:tab w:val="left" w:pos="6412"/>
+          <w:tab w:val="left" w:pos="7328"/>
+          <w:tab w:val="left" w:pos="8244"/>
+          <w:tab w:val="left" w:pos="9160"/>
+          <w:tab w:val="left" w:pos="10076"/>
+          <w:tab w:val="left" w:pos="10992"/>
+          <w:tab w:val="left" w:pos="11908"/>
+          <w:tab w:val="left" w:pos="12824"/>
+          <w:tab w:val="left" w:pos="13740"/>
+          <w:tab w:val="left" w:pos="14656"/>
+        </w:tabs>
+        <w:spacing w:after="0" w:line="240" w:lineRule="auto"/>
+        <w:rPr>
+          <w:rFonts w:ascii="Courier New" w:eastAsia="Times New Roman" w:hAnsi="Courier New" w:cs="Courier New"/>
+          <w:sz w:val="20"/>
+          <w:szCs w:val="20"/>
+          <w:lang w:eastAsia="fr-FR"/>
+        </w:rPr>
+      </w:pPr>
+      <w:proofErr w:type="spellStart"/>
+      <w:proofErr w:type="gramStart"/>
+      <w:r>
+        <w:rPr>
+          <w:rFonts w:ascii="Courier New" w:eastAsia="Times New Roman" w:hAnsi="Courier New" w:cs="Courier New"/>
+          <w:sz w:val="20"/>
+          <w:szCs w:val="20"/>
+          <w:lang w:eastAsia="fr-FR"/>
+        </w:rPr>
+        <w:t>const</w:t>
+      </w:r>
+      <w:proofErr w:type="spellEnd"/>
+      <w:proofErr w:type="gramEnd"/>
+      <w:r>
+        <w:rPr>
+          <w:rFonts w:ascii="Courier New" w:eastAsia="Times New Roman" w:hAnsi="Courier New" w:cs="Courier New"/>
+          <w:sz w:val="20"/>
+          <w:szCs w:val="20"/>
+          <w:lang w:eastAsia="fr-FR"/>
+        </w:rPr>
+        <w:t xml:space="preserve"> </w:t>
+      </w:r>
+      <w:proofErr w:type="spellStart"/>
+      <w:r>
+        <w:rPr>
+          <w:rFonts w:ascii="Courier New" w:eastAsia="Times New Roman" w:hAnsi="Courier New" w:cs="Courier New"/>
+          <w:sz w:val="20"/>
+          <w:szCs w:val="20"/>
+          <w:lang w:eastAsia="fr-FR"/>
+        </w:rPr>
+        <w:t>obj</w:t>
+      </w:r>
+      <w:proofErr w:type="spellEnd"/>
+      <w:r>
+        <w:rPr>
+          <w:rFonts w:ascii="Courier New" w:eastAsia="Times New Roman" w:hAnsi="Courier New" w:cs="Courier New"/>
+          <w:sz w:val="20"/>
+          <w:szCs w:val="20"/>
+          <w:lang w:eastAsia="fr-FR"/>
+        </w:rPr>
+        <w:t xml:space="preserve"> = {</w:t>
+      </w:r>
+    </w:p>
+    <w:p>
+      <w:pPr>
+        <w:numPr>
+          <w:ilvl w:val="0"/>
+          <w:numId w:val="4"/>
+        </w:numPr>
+        <w:tabs>
+          <w:tab w:val="clear" w:pos="720"/>
+          <w:tab w:val="left" w:pos="916"/>
+          <w:tab w:val="left" w:pos="1832"/>
+          <w:tab w:val="left" w:pos="2748"/>
+          <w:tab w:val="left" w:pos="3664"/>
+          <w:tab w:val="left" w:pos="4580"/>
+          <w:tab w:val="left" w:pos="5496"/>
+          <w:tab w:val="left" w:pos="6412"/>
+          <w:tab w:val="left" w:pos="7328"/>
+          <w:tab w:val="left" w:pos="8244"/>
+          <w:tab w:val="left" w:pos="9160"/>
+          <w:tab w:val="left" w:pos="10076"/>
+          <w:tab w:val="left" w:pos="10992"/>
+          <w:tab w:val="left" w:pos="11908"/>
+          <w:tab w:val="left" w:pos="12824"/>
+          <w:tab w:val="left" w:pos="13740"/>
+          <w:tab w:val="left" w:pos="14656"/>
+        </w:tabs>
+        <w:spacing w:after="0" w:line="240" w:lineRule="auto"/>
+        <w:rPr>
+          <w:rFonts w:ascii="Courier New" w:eastAsia="Times New Roman" w:hAnsi="Courier New" w:cs="Courier New"/>
+          <w:sz w:val="20"/>
+          <w:szCs w:val="20"/>
+          <w:lang w:eastAsia="fr-FR"/>
+        </w:rPr>
+      </w:pPr>
+      <w:r>
+        <w:rPr>
+          <w:rFonts w:ascii="Courier New" w:eastAsia="Times New Roman" w:hAnsi="Courier New" w:cs="Courier New"/>
+          <w:sz w:val="20"/>
+          <w:szCs w:val="20"/>
+          <w:lang w:eastAsia="fr-FR"/>
+        </w:rPr>
+        <w:t xml:space="preserve">  </w:t>
+      </w:r>
+      <w:proofErr w:type="gramStart"/>
+      <w:r>
+        <w:rPr>
+          <w:rFonts w:ascii="Courier New" w:eastAsia="Times New Roman" w:hAnsi="Courier New" w:cs="Courier New"/>
+          <w:sz w:val="20"/>
+          <w:szCs w:val="20"/>
+          <w:lang w:eastAsia="fr-FR"/>
+        </w:rPr>
+        <w:t>x</w:t>
+      </w:r>
+      <w:proofErr w:type="gramEnd"/>
+      <w:r>
+        <w:rPr>
+          <w:rFonts w:ascii="Courier New" w:eastAsia="Times New Roman" w:hAnsi="Courier New" w:cs="Courier New"/>
+          <w:sz w:val="20"/>
+          <w:szCs w:val="20"/>
+          <w:lang w:eastAsia="fr-FR"/>
+        </w:rPr>
+        <w:t>: 10,</w:t>
+      </w:r>
+    </w:p>
+    <w:p>
+      <w:pPr>
+        <w:numPr>
+          <w:ilvl w:val="0"/>
+          <w:numId w:val="4"/>
+        </w:numPr>
+        <w:tabs>
+          <w:tab w:val="clear" w:pos="720"/>
+          <w:tab w:val="left" w:pos="916"/>
+          <w:tab w:val="left" w:pos="1832"/>
+          <w:tab w:val="left" w:pos="2748"/>
+          <w:tab w:val="left" w:pos="3664"/>
+          <w:tab w:val="left" w:pos="4580"/>
+          <w:tab w:val="left" w:pos="5496"/>
+          <w:tab w:val="left" w:pos="6412"/>
+          <w:tab w:val="left" w:pos="7328"/>
+          <w:tab w:val="left" w:pos="8244"/>
+          <w:tab w:val="left" w:pos="9160"/>
+          <w:tab w:val="left" w:pos="10076"/>
+          <w:tab w:val="left" w:pos="10992"/>
+          <w:tab w:val="left" w:pos="11908"/>
+          <w:tab w:val="left" w:pos="12824"/>
+          <w:tab w:val="left" w:pos="13740"/>
+          <w:tab w:val="left" w:pos="14656"/>
+        </w:tabs>
+        <w:spacing w:after="0" w:line="240" w:lineRule="auto"/>
+        <w:rPr>
+          <w:rFonts w:ascii="Courier New" w:eastAsia="Times New Roman" w:hAnsi="Courier New" w:cs="Courier New"/>
+          <w:sz w:val="20"/>
+          <w:szCs w:val="20"/>
+          <w:lang w:val="en-US" w:eastAsia="fr-FR"/>
+        </w:rPr>
+      </w:pPr>
+      <w:r>
+        <w:rPr>
+          <w:rFonts w:ascii="Courier New" w:eastAsia="Times New Roman" w:hAnsi="Courier New" w:cs="Courier New"/>
+          <w:sz w:val="20"/>
+          <w:szCs w:val="20"/>
+          <w:lang w:val="en-US" w:eastAsia="fr-FR"/>
+        </w:rPr>
+        <w:t xml:space="preserve">  toJSON() { return { </w:t>
+      </w:r>
+      <w:proofErr w:type="spellStart"/>
+      <w:r>
+        <w:rPr>
+          <w:rFonts w:ascii="Courier New" w:eastAsia="Times New Roman" w:hAnsi="Courier New" w:cs="Courier New"/>
+          <w:sz w:val="20"/>
+          <w:szCs w:val="20"/>
+          <w:lang w:val="en-US" w:eastAsia="fr-FR"/>
+        </w:rPr>
+        <w:t>xSquared</w:t>
+      </w:r>
+      <w:proofErr w:type="spellEnd"/>
+      <w:r>
+        <w:rPr>
+          <w:rFonts w:ascii="Courier New" w:eastAsia="Times New Roman" w:hAnsi="Courier New" w:cs="Courier New"/>
+          <w:sz w:val="20"/>
+          <w:szCs w:val="20"/>
+          <w:lang w:val="en-US" w:eastAsia="fr-FR"/>
+        </w:rPr>
+        <w:t xml:space="preserve">: </w:t>
+      </w:r>
+      <w:proofErr w:type="spellStart"/>
+      <w:r>
+        <w:rPr>
+          <w:rFonts w:ascii="Courier New" w:eastAsia="Times New Roman" w:hAnsi="Courier New" w:cs="Courier New"/>
+          <w:sz w:val="20"/>
+          <w:szCs w:val="20"/>
+          <w:lang w:val="en-US" w:eastAsia="fr-FR"/>
+        </w:rPr>
+        <w:t>this.x</w:t>
+      </w:r>
+      <w:proofErr w:type="spellEnd"/>
+      <w:r>
+        <w:rPr>
+          <w:rFonts w:ascii="Courier New" w:eastAsia="Times New Roman" w:hAnsi="Courier New" w:cs="Courier New"/>
+          <w:sz w:val="20"/>
+          <w:szCs w:val="20"/>
+          <w:lang w:val="en-US" w:eastAsia="fr-FR"/>
+        </w:rPr>
+        <w:t xml:space="preserve"> * </w:t>
+      </w:r>
+      <w:proofErr w:type="spellStart"/>
+      <w:r>
+        <w:rPr>
+          <w:rFonts w:ascii="Courier New" w:eastAsia="Times New Roman" w:hAnsi="Courier New" w:cs="Courier New"/>
+          <w:sz w:val="20"/>
+          <w:szCs w:val="20"/>
+          <w:lang w:val="en-US" w:eastAsia="fr-FR"/>
+        </w:rPr>
+        <w:t>this.x</w:t>
+      </w:r>
+      <w:proofErr w:type="spellEnd"/>
+      <w:r>
+        <w:rPr>
+          <w:rFonts w:ascii="Courier New" w:eastAsia="Times New Roman" w:hAnsi="Courier New" w:cs="Courier New"/>
+          <w:sz w:val="20"/>
+          <w:szCs w:val="20"/>
+          <w:lang w:val="en-US" w:eastAsia="fr-FR"/>
+        </w:rPr>
+        <w:t xml:space="preserve"> }; }</w:t>
+      </w:r>
+    </w:p>
+    <w:p>
+      <w:pPr>
+        <w:numPr>
+          <w:ilvl w:val="0"/>
+          <w:numId w:val="4"/>
+        </w:numPr>
+        <w:tabs>
+          <w:tab w:val="clear" w:pos="720"/>
+          <w:tab w:val="left" w:pos="916"/>
+          <w:tab w:val="left" w:pos="1832"/>
+          <w:tab w:val="left" w:pos="2748"/>
+          <w:tab w:val="left" w:pos="3664"/>
+          <w:tab w:val="left" w:pos="4580"/>
+          <w:tab w:val="left" w:pos="5496"/>
+          <w:tab w:val="left" w:pos="6412"/>
+          <w:tab w:val="left" w:pos="7328"/>
+          <w:tab w:val="left" w:pos="8244"/>
+          <w:tab w:val="left" w:pos="9160"/>
+          <w:tab w:val="left" w:pos="10076"/>
+          <w:tab w:val="left" w:pos="10992"/>
+          <w:tab w:val="left" w:pos="11908"/>
+          <w:tab w:val="left" w:pos="12824"/>
+          <w:tab w:val="left" w:pos="13740"/>
+          <w:tab w:val="left" w:pos="14656"/>
+        </w:tabs>
+        <w:spacing w:after="0" w:line="240" w:lineRule="auto"/>
+        <w:rPr>
+          <w:rFonts w:ascii="Courier New" w:eastAsia="Times New Roman" w:hAnsi="Courier New" w:cs="Courier New"/>
+          <w:sz w:val="20"/>
+          <w:szCs w:val="20"/>
+          <w:lang w:eastAsia="fr-FR"/>
+        </w:rPr>
+      </w:pPr>
+      <w:r>
+        <w:rPr>
+          <w:rFonts w:ascii="Courier New" w:eastAsia="Times New Roman" w:hAnsi="Courier New" w:cs="Courier New"/>
+          <w:sz w:val="20"/>
+          <w:szCs w:val="20"/>
+          <w:lang w:eastAsia="fr-FR"/>
+        </w:rPr>
+        <w:t>};</w:t>
+      </w:r>
+    </w:p>
+    <w:p>
+      <w:pPr>
+        <w:numPr>
+          <w:ilvl w:val="0"/>
+          <w:numId w:val="4"/>
+        </w:numPr>
+        <w:tabs>
+          <w:tab w:val="clear" w:pos="720"/>
+          <w:tab w:val="left" w:pos="916"/>
+          <w:tab w:val="left" w:pos="1832"/>
+          <w:tab w:val="left" w:pos="2748"/>
+          <w:tab w:val="left" w:pos="3664"/>
+          <w:tab w:val="left" w:pos="4580"/>
+          <w:tab w:val="left" w:pos="5496"/>
+          <w:tab w:val="left" w:pos="6412"/>
+          <w:tab w:val="left" w:pos="7328"/>
+          <w:tab w:val="left" w:pos="8244"/>
+          <w:tab w:val="left" w:pos="9160"/>
+          <w:tab w:val="left" w:pos="10076"/>
+          <w:tab w:val="left" w:pos="10992"/>
+          <w:tab w:val="left" w:pos="11908"/>
+          <w:tab w:val="left" w:pos="12824"/>
+          <w:tab w:val="left" w:pos="13740"/>
+          <w:tab w:val="left" w:pos="14656"/>
+        </w:tabs>
+        <w:spacing w:after="0" w:line="240" w:lineRule="auto"/>
+        <w:rPr>
+          <w:rFonts w:ascii="Courier New" w:eastAsia="Times New Roman" w:hAnsi="Courier New" w:cs="Courier New"/>
+          <w:sz w:val="20"/>
+          <w:szCs w:val="20"/>
+          <w:lang w:val="en-US" w:eastAsia="fr-FR"/>
+        </w:rPr>
+      </w:pPr>
+      <w:r>
+        <w:rPr>
+          <w:rFonts w:ascii="Courier New" w:eastAsia="Times New Roman" w:hAnsi="Courier New" w:cs="Courier New"/>
+          <w:sz w:val="20"/>
+          <w:szCs w:val="20"/>
+          <w:lang w:val="en-US" w:eastAsia="fr-FR"/>
+        </w:rPr>
+        <w:t>JSON.stringify(obj); // '{"xSquared":100}'</w:t>
+      </w:r>
+    </w:p>
+    <w:p>
+      <w:pPr>
+        <w:numPr>
+          <w:ilvl w:val="0"/>
+          <w:numId w:val="4"/>
+        </w:numPr>
+        <w:spacing w:before="100" w:beforeAutospacing="1" w:after="100" w:afterAutospacing="1" w:line="240" w:lineRule="auto"/>
+        <w:rPr>
+          <w:rFonts w:ascii="Times New Roman" w:eastAsia="Times New Roman" w:hAnsi="Times New Roman" w:cs="Times New Roman"/>
+          <w:sz w:val="24"/>
+          <w:szCs w:val="24"/>
+          <w:lang w:eastAsia="fr-FR"/>
+        </w:rPr>
+      </w:pPr>
+      <w:r>
+        <w:rPr>
+          <w:rFonts w:ascii="Courier New" w:eastAsia="Times New Roman" w:hAnsi="Courier New" w:cs="Courier New"/>
+          <w:b/>
+          <w:bCs/>
+          <w:sz w:val="20"/>
+          <w:szCs w:val="20"/>
+          <w:lang w:eastAsia="fr-FR"/>
+        </w:rPr>
+        <w:t>JSON.parse</w:t>
+      </w:r>
+      <w:r>
+        <w:rPr>
+          <w:rFonts w:ascii="Times New Roman" w:eastAsia="Times New Roman" w:hAnsi="Times New Roman" w:cs="Times New Roman"/>
+          <w:sz w:val="24"/>
+          <w:szCs w:val="24"/>
+          <w:lang w:eastAsia="fr-FR"/>
+        </w:rPr>
+        <w:br/>
+        <w:t>Transforme une chaîne JSON en objet JavaScript exploitable :</w:t>
+      </w:r>
+    </w:p>
+    <w:p>
+      <w:pPr>
+        <w:numPr>
+          <w:ilvl w:val="0"/>
+          <w:numId w:val="4"/>
+        </w:numPr>
+        <w:tabs>
+          <w:tab w:val="clear" w:pos="720"/>
+          <w:tab w:val="left" w:pos="916"/>
+          <w:tab w:val="left" w:pos="1832"/>
+          <w:tab w:val="left" w:pos="2748"/>
+          <w:tab w:val="left" w:pos="3664"/>
+          <w:tab w:val="left" w:pos="4580"/>
+          <w:tab w:val="left" w:pos="5496"/>
+          <w:tab w:val="left" w:pos="6412"/>
+          <w:tab w:val="left" w:pos="7328"/>
+          <w:tab w:val="left" w:pos="8244"/>
+          <w:tab w:val="left" w:pos="9160"/>
+          <w:tab w:val="left" w:pos="10076"/>
+          <w:tab w:val="left" w:pos="10992"/>
+          <w:tab w:val="left" w:pos="11908"/>
+          <w:tab w:val="left" w:pos="12824"/>
+          <w:tab w:val="left" w:pos="13740"/>
+          <w:tab w:val="left" w:pos="14656"/>
+        </w:tabs>
+        <w:spacing w:after="0" w:line="240" w:lineRule="auto"/>
+        <w:rPr>
+          <w:rFonts w:ascii="Courier New" w:eastAsia="Times New Roman" w:hAnsi="Courier New" w:cs="Courier New"/>
+          <w:sz w:val="20"/>
+          <w:szCs w:val="20"/>
+          <w:lang w:val="en-US" w:eastAsia="fr-FR"/>
+        </w:rPr>
+      </w:pPr>
+      <w:r>
+        <w:rPr>
+          <w:rFonts w:ascii="Courier New" w:eastAsia="Times New Roman" w:hAnsi="Courier New" w:cs="Courier New"/>
+          <w:sz w:val="20"/>
+          <w:szCs w:val="20"/>
+          <w:lang w:val="en-US" w:eastAsia="fr-FR"/>
+        </w:rPr>
+        <w:t xml:space="preserve">const </w:t>
+      </w:r>
+      <w:proofErr w:type="spellStart"/>
+      <w:r>
+        <w:rPr>
+          <w:rFonts w:ascii="Courier New" w:eastAsia="Times New Roman" w:hAnsi="Courier New" w:cs="Courier New"/>
+          <w:sz w:val="20"/>
+          <w:szCs w:val="20"/>
+          <w:lang w:val="en-US" w:eastAsia="fr-FR"/>
+        </w:rPr>
+        <w:t>str</w:t>
+      </w:r>
+      <w:proofErr w:type="spellEnd"/>
+      <w:r>
+        <w:rPr>
+          <w:rFonts w:ascii="Courier New" w:eastAsia="Times New Roman" w:hAnsi="Courier New" w:cs="Courier New"/>
+          <w:sz w:val="20"/>
+          <w:szCs w:val="20"/>
+          <w:lang w:val="en-US" w:eastAsia="fr-FR"/>
+        </w:rPr>
+        <w:t xml:space="preserve"> = '{"name":"Anna","age":30}';</w:t>
+      </w:r>
+    </w:p>
+    <w:p>
+      <w:pPr>
+        <w:numPr>
+          <w:ilvl w:val="0"/>
+          <w:numId w:val="4"/>
+        </w:numPr>
+        <w:tabs>
+          <w:tab w:val="clear" w:pos="720"/>
+          <w:tab w:val="left" w:pos="916"/>
+          <w:tab w:val="left" w:pos="1832"/>
+          <w:tab w:val="left" w:pos="2748"/>
+          <w:tab w:val="left" w:pos="3664"/>
+          <w:tab w:val="left" w:pos="4580"/>
+          <w:tab w:val="left" w:pos="5496"/>
+          <w:tab w:val="left" w:pos="6412"/>
+          <w:tab w:val="left" w:pos="7328"/>
+          <w:tab w:val="left" w:pos="8244"/>
+          <w:tab w:val="left" w:pos="9160"/>
+          <w:tab w:val="left" w:pos="10076"/>
+          <w:tab w:val="left" w:pos="10992"/>
+          <w:tab w:val="left" w:pos="11908"/>
+          <w:tab w:val="left" w:pos="12824"/>
+          <w:tab w:val="left" w:pos="13740"/>
+          <w:tab w:val="left" w:pos="14656"/>
+        </w:tabs>
+        <w:spacing w:after="0" w:line="240" w:lineRule="auto"/>
+        <w:rPr>
+          <w:rFonts w:ascii="Courier New" w:eastAsia="Times New Roman" w:hAnsi="Courier New" w:cs="Courier New"/>
+          <w:sz w:val="20"/>
+          <w:szCs w:val="20"/>
+          <w:lang w:eastAsia="fr-FR"/>
+        </w:rPr>
+      </w:pPr>
+      <w:proofErr w:type="gramStart"/>
+      <w:r>
+        <w:rPr>
+          <w:rFonts w:ascii="Courier New" w:eastAsia="Times New Roman" w:hAnsi="Courier New" w:cs="Courier New"/>
+          <w:sz w:val="20"/>
+          <w:szCs w:val="20"/>
+          <w:lang w:eastAsia="fr-FR"/>
+        </w:rPr>
+        <w:t>const</w:t>
+      </w:r>
+      <w:proofErr w:type="gramEnd"/>
+      <w:r>
+        <w:rPr>
+          <w:rFonts w:ascii="Courier New" w:eastAsia="Times New Roman" w:hAnsi="Courier New" w:cs="Courier New"/>
+          <w:sz w:val="20"/>
+          <w:szCs w:val="20"/>
+          <w:lang w:eastAsia="fr-FR"/>
+        </w:rPr>
+        <w:t xml:space="preserve"> </w:t>
+      </w:r>
+      <w:proofErr w:type="spellStart"/>
+      <w:r>
+        <w:rPr>
+          <w:rFonts w:ascii="Courier New" w:eastAsia="Times New Roman" w:hAnsi="Courier New" w:cs="Courier New"/>
+          <w:sz w:val="20"/>
+          <w:szCs w:val="20"/>
+          <w:lang w:eastAsia="fr-FR"/>
+        </w:rPr>
+        <w:t>obj</w:t>
+      </w:r>
+      <w:proofErr w:type="spellEnd"/>
+      <w:r>
+        <w:rPr>
+          <w:rFonts w:ascii="Courier New" w:eastAsia="Times New Roman" w:hAnsi="Courier New" w:cs="Courier New"/>
+          <w:sz w:val="20"/>
+          <w:szCs w:val="20"/>
+          <w:lang w:eastAsia="fr-FR"/>
+        </w:rPr>
+        <w:t xml:space="preserve"> = </w:t>
+      </w:r>
+      <w:proofErr w:type="spellStart"/>
+      <w:r>
+        <w:rPr>
+          <w:rFonts w:ascii="Courier New" w:eastAsia="Times New Roman" w:hAnsi="Courier New" w:cs="Courier New"/>
+          <w:sz w:val="20"/>
+          <w:szCs w:val="20"/>
+          <w:lang w:eastAsia="fr-FR"/>
+        </w:rPr>
+        <w:t>JSON.parse</w:t>
+      </w:r>
+      <w:proofErr w:type="spellEnd"/>
+      <w:r>
+        <w:rPr>
+          <w:rFonts w:ascii="Courier New" w:eastAsia="Times New Roman" w:hAnsi="Courier New" w:cs="Courier New"/>
+          <w:sz w:val="20"/>
+          <w:szCs w:val="20"/>
+          <w:lang w:eastAsia="fr-FR"/>
+        </w:rPr>
+        <w:t>(</w:t>
+      </w:r>
+      <w:proofErr w:type="spellStart"/>
+      <w:r>
+        <w:rPr>
+          <w:rFonts w:ascii="Courier New" w:eastAsia="Times New Roman" w:hAnsi="Courier New" w:cs="Courier New"/>
+          <w:sz w:val="20"/>
+          <w:szCs w:val="20"/>
+          <w:lang w:eastAsia="fr-FR"/>
+        </w:rPr>
+        <w:t>str</w:t>
+      </w:r>
+      <w:proofErr w:type="spellEnd"/>
+      <w:r>
+        <w:rPr>
+          <w:rFonts w:ascii="Courier New" w:eastAsia="Times New Roman" w:hAnsi="Courier New" w:cs="Courier New"/>
+          <w:sz w:val="20"/>
+          <w:szCs w:val="20"/>
+          <w:lang w:eastAsia="fr-FR"/>
+        </w:rPr>
+        <w:t>);</w:t>
+      </w:r>
+    </w:p>
+    <w:p>
+      <w:pPr>
+        <w:numPr>
+          <w:ilvl w:val="0"/>
+          <w:numId w:val="4"/>
+        </w:numPr>
+        <w:tabs>
+          <w:tab w:val="clear" w:pos="720"/>
+          <w:tab w:val="left" w:pos="916"/>
+          <w:tab w:val="left" w:pos="1832"/>
+          <w:tab w:val="left" w:pos="2748"/>
+          <w:tab w:val="left" w:pos="3664"/>
+          <w:tab w:val="left" w:pos="4580"/>
+          <w:tab w:val="left" w:pos="5496"/>
+          <w:tab w:val="left" w:pos="6412"/>
+          <w:tab w:val="left" w:pos="7328"/>
+          <w:tab w:val="left" w:pos="8244"/>
+          <w:tab w:val="left" w:pos="9160"/>
+          <w:tab w:val="left" w:pos="10076"/>
+          <w:tab w:val="left" w:pos="10992"/>
+          <w:tab w:val="left" w:pos="11908"/>
+          <w:tab w:val="left" w:pos="12824"/>
+          <w:tab w:val="left" w:pos="13740"/>
+          <w:tab w:val="left" w:pos="14656"/>
+        </w:tabs>
+        <w:spacing w:after="0" w:line="240" w:lineRule="auto"/>
+        <w:rPr>
+          <w:rFonts w:ascii="Courier New" w:eastAsia="Times New Roman" w:hAnsi="Courier New" w:cs="Courier New"/>
+          <w:sz w:val="20"/>
+          <w:szCs w:val="20"/>
+          <w:lang w:val="en-US" w:eastAsia="fr-FR"/>
+        </w:rPr>
+      </w:pPr>
+      <w:r>
+        <w:rPr>
+          <w:rFonts w:ascii="Courier New" w:eastAsia="Times New Roman" w:hAnsi="Courier New" w:cs="Courier New"/>
+          <w:sz w:val="20"/>
+          <w:szCs w:val="20"/>
+          <w:lang w:val="en-US" w:eastAsia="fr-FR"/>
+        </w:rPr>
+        <w:t xml:space="preserve">// obj.name === "Anna", </w:t>
+      </w:r>
+      <w:proofErr w:type="spellStart"/>
+      <w:r>
+        <w:rPr>
+          <w:rFonts w:ascii="Courier New" w:eastAsia="Times New Roman" w:hAnsi="Courier New" w:cs="Courier New"/>
+          <w:sz w:val="20"/>
+          <w:szCs w:val="20"/>
+          <w:lang w:val="en-US" w:eastAsia="fr-FR"/>
+        </w:rPr>
+        <w:t>obj.age</w:t>
+      </w:r>
+      <w:proofErr w:type="spellEnd"/>
+      <w:r>
+        <w:rPr>
+          <w:rFonts w:ascii="Courier New" w:eastAsia="Times New Roman" w:hAnsi="Courier New" w:cs="Courier New"/>
+          <w:sz w:val="20"/>
+          <w:szCs w:val="20"/>
+          <w:lang w:val="en-US" w:eastAsia="fr-FR"/>
+        </w:rPr>
+        <w:t xml:space="preserve"> === 30</w:t>
+      </w:r>
+    </w:p>
+    <w:p>
+      <w:pPr>
+        <w:numPr>
+          <w:ilvl w:val="0"/>
+          <w:numId w:val="4"/>
+        </w:numPr>
+        <w:spacing w:before="100" w:beforeAutospacing="1" w:after="100" w:afterAutospacing="1" w:line="240" w:lineRule="auto"/>
+        <w:rPr>
+          <w:rFonts w:ascii="Times New Roman" w:eastAsia="Times New Roman" w:hAnsi="Times New Roman" w:cs="Times New Roman"/>
+          <w:sz w:val="24"/>
+          <w:szCs w:val="24"/>
+          <w:lang w:eastAsia="fr-FR"/>
+        </w:rPr>
+      </w:pPr>
+      <w:r>
+        <w:rPr>
+          <w:rFonts w:ascii="Times New Roman" w:eastAsia="Times New Roman" w:hAnsi="Times New Roman" w:cs="Times New Roman"/>
+          <w:b/>
+          <w:bCs/>
+          <w:sz w:val="24"/>
+          <w:szCs w:val="24"/>
+          <w:lang w:eastAsia="fr-FR"/>
+        </w:rPr>
+        <w:t>Résumé</w:t>
+      </w:r>
+      <w:r>
+        <w:rPr>
+          <w:rFonts w:ascii="Times New Roman" w:eastAsia="Times New Roman" w:hAnsi="Times New Roman" w:cs="Times New Roman"/>
+          <w:sz w:val="24"/>
+          <w:szCs w:val="24"/>
+          <w:lang w:eastAsia="fr-FR"/>
+        </w:rPr>
+        <w:br/>
+        <w:t xml:space="preserve">JSON est le langage universel des échanges de données. Avec </w:t>
+      </w:r>
+      <w:proofErr w:type="spellStart"/>
+      <w:r>
+        <w:rPr>
+          <w:rFonts w:ascii="Courier New" w:eastAsia="Times New Roman" w:hAnsi="Courier New" w:cs="Courier New"/>
+          <w:sz w:val="20"/>
+          <w:szCs w:val="20"/>
+          <w:lang w:eastAsia="fr-FR"/>
+        </w:rPr>
+        <w:t>JSON.stringify</w:t>
+      </w:r>
+      <w:proofErr w:type="spellEnd"/>
+      <w:r>
+        <w:rPr>
+          <w:rFonts w:ascii="Times New Roman" w:eastAsia="Times New Roman" w:hAnsi="Times New Roman" w:cs="Times New Roman"/>
+          <w:sz w:val="24"/>
+          <w:szCs w:val="24"/>
+          <w:lang w:eastAsia="fr-FR"/>
+        </w:rPr>
+        <w:t xml:space="preserve"> tu passes de l’objet JS à la chaîne, avec </w:t>
+      </w:r>
+      <w:proofErr w:type="spellStart"/>
+      <w:r>
+        <w:rPr>
+          <w:rFonts w:ascii="Courier New" w:eastAsia="Times New Roman" w:hAnsi="Courier New" w:cs="Courier New"/>
+          <w:sz w:val="20"/>
+          <w:szCs w:val="20"/>
+          <w:lang w:eastAsia="fr-FR"/>
+        </w:rPr>
+        <w:t>JSON.parse</w:t>
+      </w:r>
+      <w:proofErr w:type="spellEnd"/>
+      <w:r>
+        <w:rPr>
+          <w:rFonts w:ascii="Times New Roman" w:eastAsia="Times New Roman" w:hAnsi="Times New Roman" w:cs="Times New Roman"/>
+          <w:sz w:val="24"/>
+          <w:szCs w:val="24"/>
+          <w:lang w:eastAsia="fr-FR"/>
+        </w:rPr>
+        <w:t xml:space="preserve"> tu reviens à l’objet. Grâce à </w:t>
+      </w:r>
+      <w:proofErr w:type="spellStart"/>
+      <w:r>
+        <w:rPr>
+          <w:rFonts w:ascii="Courier New" w:eastAsia="Times New Roman" w:hAnsi="Courier New" w:cs="Courier New"/>
+          <w:sz w:val="20"/>
+          <w:szCs w:val="20"/>
+          <w:lang w:eastAsia="fr-FR"/>
+        </w:rPr>
+        <w:t>toJSON</w:t>
+      </w:r>
+      <w:proofErr w:type="spellEnd"/>
+      <w:r>
+        <w:rPr>
+          <w:rFonts w:ascii="Times New Roman" w:eastAsia="Times New Roman" w:hAnsi="Times New Roman" w:cs="Times New Roman"/>
+          <w:sz w:val="24"/>
+          <w:szCs w:val="24"/>
+          <w:lang w:eastAsia="fr-FR"/>
+        </w:rPr>
+        <w:t>, tu peux personnaliser la conversion, et avec l’indentation tu simplifies la lecture. Simple, rapide, efficace !</w:t>
+      </w:r>
+    </w:p>
+    <w:p>
+      <w:pPr>
+        <w:pStyle w:val="Titre1"/>
+        <w:rPr>
+          <w:rFonts w:ascii="Times New Roman" w:eastAsia="Times New Roman" w:hAnsi="Times New Roman" w:cs="Times New Roman"/>
+          <w:sz w:val="24"/>
+          <w:szCs w:val="24"/>
+          <w:lang w:eastAsia="fr-FR"/>
+        </w:rPr>
+      </w:pPr>
+      <w:r>
+        <w:rPr>
+          <w:rStyle w:val="lev"/>
+        </w:rPr>
+        <w:t>Exception &amp; Catch</w:t>
+      </w:r>
+    </w:p>
+    <w:p>
+      <w:pPr>
+        <w:pStyle w:val="NormalWeb"/>
+        <w:numPr>
+          <w:ilvl w:val="0"/>
+          <w:numId w:val="5"/>
+        </w:numPr>
+      </w:pPr>
+      <w:r>
+        <w:rPr>
+          <w:rStyle w:val="lev"/>
+        </w:rPr>
+        <w:t>Qu’est-ce qu’une exception ?</w:t>
+      </w:r>
+      <w:r>
+        <w:br/>
+        <w:t>C’est un signal qu’une erreur ou une situation imprévue est survenue pendant l’exécution d’un programme. Plutôt que de planter sauvagement, le langage “lance” (</w:t>
+      </w:r>
+      <w:proofErr w:type="spellStart"/>
+      <w:r>
+        <w:t>throw</w:t>
+      </w:r>
+      <w:proofErr w:type="spellEnd"/>
+      <w:r>
+        <w:t>) une exception pour que tu puisses la gérer.</w:t>
+      </w:r>
+    </w:p>
+    <w:p>
+      <w:pPr>
+        <w:pStyle w:val="NormalWeb"/>
+        <w:numPr>
+          <w:ilvl w:val="0"/>
+          <w:numId w:val="5"/>
+        </w:numPr>
+      </w:pPr>
+      <w:proofErr w:type="spellStart"/>
+      <w:proofErr w:type="gramStart"/>
+      <w:r>
+        <w:rPr>
+          <w:rStyle w:val="CodeHTML"/>
+          <w:rFonts w:eastAsiaTheme="majorEastAsia"/>
+          <w:b/>
+          <w:bCs/>
+        </w:rPr>
+        <w:t>try</w:t>
+      </w:r>
+      <w:proofErr w:type="spellEnd"/>
+      <w:proofErr w:type="gramEnd"/>
+      <w:r>
+        <w:rPr>
+          <w:rStyle w:val="CodeHTML"/>
+          <w:rFonts w:eastAsiaTheme="majorEastAsia"/>
+          <w:b/>
+          <w:bCs/>
+        </w:rPr>
+        <w:t>…catch</w:t>
+      </w:r>
+    </w:p>
+    <w:p>
+      <w:pPr>
+        <w:pStyle w:val="NormalWeb"/>
+        <w:numPr>
+          <w:ilvl w:val="1"/>
+          <w:numId w:val="5"/>
+        </w:numPr>
+      </w:pPr>
+      <w:proofErr w:type="spellStart"/>
+      <w:proofErr w:type="gramStart"/>
+      <w:r>
+        <w:rPr>
+          <w:rStyle w:val="CodeHTML"/>
+          <w:rFonts w:eastAsiaTheme="majorEastAsia"/>
+          <w:b/>
+          <w:bCs/>
+        </w:rPr>
+        <w:t>try</w:t>
+      </w:r>
+      <w:proofErr w:type="spellEnd"/>
+      <w:proofErr w:type="gramEnd"/>
+      <w:r>
+        <w:t xml:space="preserve"> : tu encadres le bloc de code susceptible de provoquer une exception.</w:t>
+      </w:r>
+    </w:p>
+    <w:p>
+      <w:pPr>
+        <w:pStyle w:val="NormalWeb"/>
+        <w:numPr>
+          <w:ilvl w:val="1"/>
+          <w:numId w:val="5"/>
+        </w:numPr>
+      </w:pPr>
+      <w:proofErr w:type="gramStart"/>
+      <w:r>
+        <w:rPr>
+          <w:rStyle w:val="CodeHTML"/>
+          <w:rFonts w:eastAsiaTheme="majorEastAsia"/>
+          <w:b/>
+          <w:bCs/>
+        </w:rPr>
+        <w:t>catch</w:t>
+      </w:r>
+      <w:proofErr w:type="gramEnd"/>
+      <w:r>
+        <w:t xml:space="preserve"> : si une exception est lancée, tu la captures ici pour la traiter (journaliser, afficher un message sympa, corriger le tir…).</w:t>
+      </w:r>
+    </w:p>
+    <w:p>
+      <w:pPr>
+        <w:pStyle w:val="PrformatHTML"/>
+        <w:numPr>
+          <w:ilvl w:val="0"/>
+          <w:numId w:val="5"/>
+        </w:numPr>
+        <w:tabs>
+          <w:tab w:val="clear" w:pos="720"/>
+        </w:tabs>
+        <w:rPr>
+          <w:rStyle w:val="CodeHTML"/>
+          <w:rFonts w:eastAsiaTheme="majorEastAsia"/>
+        </w:rPr>
+      </w:pPr>
+      <w:proofErr w:type="spellStart"/>
+      <w:proofErr w:type="gramStart"/>
+      <w:r>
+        <w:rPr>
+          <w:rStyle w:val="CodeHTML"/>
+          <w:rFonts w:eastAsiaTheme="majorEastAsia"/>
+        </w:rPr>
+        <w:t>try</w:t>
+      </w:r>
+      <w:proofErr w:type="spellEnd"/>
+      <w:proofErr w:type="gramEnd"/>
+      <w:r>
+        <w:rPr>
+          <w:rStyle w:val="CodeHTML"/>
+          <w:rFonts w:eastAsiaTheme="majorEastAsia"/>
+        </w:rPr>
+        <w:t xml:space="preserve"> {</w:t>
+      </w:r>
+    </w:p>
+    <w:p>
+      <w:pPr>
+        <w:pStyle w:val="PrformatHTML"/>
+        <w:numPr>
+          <w:ilvl w:val="0"/>
+          <w:numId w:val="5"/>
+        </w:numPr>
+        <w:tabs>
+          <w:tab w:val="clear" w:pos="720"/>
+        </w:tabs>
+        <w:rPr>
+          <w:rStyle w:val="CodeHTML"/>
+          <w:rFonts w:eastAsiaTheme="majorEastAsia"/>
+        </w:rPr>
+      </w:pPr>
+      <w:r>
+        <w:rPr>
+          <w:rStyle w:val="CodeHTML"/>
+          <w:rFonts w:eastAsiaTheme="majorEastAsia"/>
+        </w:rPr>
+        <w:t xml:space="preserve">  // code risqué</w:t>
+      </w:r>
+    </w:p>
+    <w:p>
+      <w:pPr>
+        <w:pStyle w:val="PrformatHTML"/>
+        <w:numPr>
+          <w:ilvl w:val="0"/>
+          <w:numId w:val="5"/>
+        </w:numPr>
+        <w:tabs>
+          <w:tab w:val="clear" w:pos="720"/>
+        </w:tabs>
+        <w:rPr>
+          <w:rStyle w:val="CodeHTML"/>
+          <w:rFonts w:eastAsiaTheme="majorEastAsia"/>
+        </w:rPr>
+      </w:pPr>
+      <w:r>
+        <w:rPr>
+          <w:rStyle w:val="CodeHTML"/>
+          <w:rFonts w:eastAsiaTheme="majorEastAsia"/>
+        </w:rPr>
+        <w:t>} catch (</w:t>
+      </w:r>
+      <w:proofErr w:type="spellStart"/>
+      <w:r>
+        <w:rPr>
+          <w:rStyle w:val="CodeHTML"/>
+          <w:rFonts w:eastAsiaTheme="majorEastAsia"/>
+        </w:rPr>
+        <w:t>error</w:t>
+      </w:r>
+      <w:proofErr w:type="spellEnd"/>
+      <w:r>
+        <w:rPr>
+          <w:rStyle w:val="CodeHTML"/>
+          <w:rFonts w:eastAsiaTheme="majorEastAsia"/>
+        </w:rPr>
+        <w:t>) {</w:t>
+      </w:r>
+    </w:p>
+    <w:p>
+      <w:pPr>
+        <w:pStyle w:val="PrformatHTML"/>
+        <w:numPr>
+          <w:ilvl w:val="0"/>
+          <w:numId w:val="5"/>
+        </w:numPr>
+        <w:tabs>
+          <w:tab w:val="clear" w:pos="720"/>
+        </w:tabs>
+        <w:rPr>
+          <w:rStyle w:val="CodeHTML"/>
+          <w:rFonts w:eastAsiaTheme="majorEastAsia"/>
+        </w:rPr>
+      </w:pPr>
+      <w:r>
+        <w:rPr>
+          <w:rStyle w:val="CodeHTML"/>
+          <w:rFonts w:eastAsiaTheme="majorEastAsia"/>
+        </w:rPr>
+        <w:t xml:space="preserve">  </w:t>
+      </w:r>
+      <w:proofErr w:type="spellStart"/>
+      <w:proofErr w:type="gramStart"/>
+      <w:r>
+        <w:rPr>
+          <w:rStyle w:val="CodeHTML"/>
+          <w:rFonts w:eastAsiaTheme="majorEastAsia"/>
+        </w:rPr>
+        <w:t>console.error</w:t>
+      </w:r>
+      <w:proofErr w:type="spellEnd"/>
+      <w:proofErr w:type="gramEnd"/>
+      <w:r>
+        <w:rPr>
+          <w:rStyle w:val="CodeHTML"/>
+          <w:rFonts w:eastAsiaTheme="majorEastAsia"/>
+        </w:rPr>
+        <w:t xml:space="preserve">("Oups, quelque chose s'est mal passé :", </w:t>
+      </w:r>
+      <w:proofErr w:type="spellStart"/>
+      <w:r>
+        <w:rPr>
+          <w:rStyle w:val="CodeHTML"/>
+          <w:rFonts w:eastAsiaTheme="majorEastAsia"/>
+        </w:rPr>
+        <w:t>error</w:t>
+      </w:r>
+      <w:proofErr w:type="spellEnd"/>
+      <w:r>
+        <w:rPr>
+          <w:rStyle w:val="CodeHTML"/>
+          <w:rFonts w:eastAsiaTheme="majorEastAsia"/>
+        </w:rPr>
+        <w:t>);</w:t>
+      </w:r>
+    </w:p>
+    <w:p>
+      <w:pPr>
+        <w:pStyle w:val="PrformatHTML"/>
+        <w:numPr>
+          <w:ilvl w:val="0"/>
+          <w:numId w:val="5"/>
+        </w:numPr>
+        <w:tabs>
+          <w:tab w:val="clear" w:pos="720"/>
+        </w:tabs>
+        <w:rPr>
+          <w:rStyle w:val="CodeHTML"/>
+          <w:rFonts w:eastAsiaTheme="majorEastAsia"/>
+        </w:rPr>
+      </w:pPr>
+      <w:r>
+        <w:rPr>
+          <w:rStyle w:val="CodeHTML"/>
+          <w:rFonts w:eastAsiaTheme="majorEastAsia"/>
+        </w:rPr>
+        <w:t>}</w:t>
+      </w:r>
+    </w:p>
+    <w:p>
+      <w:pPr>
+        <w:pStyle w:val="NormalWeb"/>
+        <w:numPr>
+          <w:ilvl w:val="0"/>
+          <w:numId w:val="5"/>
+        </w:numPr>
+      </w:pPr>
+      <w:proofErr w:type="spellStart"/>
+      <w:r>
+        <w:rPr>
+          <w:rStyle w:val="CodeHTML"/>
+          <w:rFonts w:eastAsiaTheme="majorEastAsia"/>
+          <w:b/>
+          <w:bCs/>
+        </w:rPr>
+        <w:t>finally</w:t>
+      </w:r>
+      <w:proofErr w:type="spellEnd"/>
+      <w:r>
+        <w:br/>
+        <w:t xml:space="preserve">C’est le coin “peu importe ce qu’il arrive”. Le bloc </w:t>
+      </w:r>
+      <w:proofErr w:type="spellStart"/>
+      <w:r>
+        <w:rPr>
+          <w:rStyle w:val="CodeHTML"/>
+          <w:rFonts w:eastAsiaTheme="majorEastAsia"/>
+        </w:rPr>
+        <w:t>finally</w:t>
+      </w:r>
+      <w:proofErr w:type="spellEnd"/>
+      <w:r>
+        <w:t xml:space="preserve"> s’exécute toujours, que le </w:t>
+      </w:r>
+      <w:proofErr w:type="spellStart"/>
+      <w:r>
+        <w:rPr>
+          <w:rStyle w:val="CodeHTML"/>
+          <w:rFonts w:eastAsiaTheme="majorEastAsia"/>
+        </w:rPr>
+        <w:t>try</w:t>
+      </w:r>
+      <w:proofErr w:type="spellEnd"/>
+      <w:r>
+        <w:t xml:space="preserve"> ait planté ou que le </w:t>
+      </w:r>
+      <w:r>
+        <w:rPr>
+          <w:rStyle w:val="CodeHTML"/>
+          <w:rFonts w:eastAsiaTheme="majorEastAsia"/>
+        </w:rPr>
+        <w:t>catch</w:t>
+      </w:r>
+      <w:r>
+        <w:t xml:space="preserve"> ait tourné. Pratique pour fermer des fichiers, libérer des ressources ou dire au café “merci” avant de partir.</w:t>
+      </w:r>
+    </w:p>
+    <w:p>
+      <w:pPr>
+        <w:pStyle w:val="PrformatHTML"/>
+        <w:numPr>
+          <w:ilvl w:val="0"/>
+          <w:numId w:val="5"/>
+        </w:numPr>
+        <w:tabs>
+          <w:tab w:val="clear" w:pos="720"/>
+        </w:tabs>
+        <w:rPr>
+          <w:rStyle w:val="CodeHTML"/>
+          <w:rFonts w:eastAsiaTheme="majorEastAsia"/>
+        </w:rPr>
+      </w:pPr>
+      <w:proofErr w:type="spellStart"/>
+      <w:proofErr w:type="gramStart"/>
+      <w:r>
+        <w:rPr>
+          <w:rStyle w:val="CodeHTML"/>
+          <w:rFonts w:eastAsiaTheme="majorEastAsia"/>
+        </w:rPr>
+        <w:lastRenderedPageBreak/>
+        <w:t>try</w:t>
+      </w:r>
+      <w:proofErr w:type="spellEnd"/>
+      <w:proofErr w:type="gramEnd"/>
+      <w:r>
+        <w:rPr>
+          <w:rStyle w:val="CodeHTML"/>
+          <w:rFonts w:eastAsiaTheme="majorEastAsia"/>
+        </w:rPr>
+        <w:t xml:space="preserve"> {</w:t>
+      </w:r>
+    </w:p>
+    <w:p>
+      <w:pPr>
+        <w:pStyle w:val="PrformatHTML"/>
+        <w:numPr>
+          <w:ilvl w:val="0"/>
+          <w:numId w:val="5"/>
+        </w:numPr>
+        <w:tabs>
+          <w:tab w:val="clear" w:pos="720"/>
+        </w:tabs>
+        <w:rPr>
+          <w:rStyle w:val="CodeHTML"/>
+          <w:rFonts w:eastAsiaTheme="majorEastAsia"/>
+        </w:rPr>
+      </w:pPr>
+      <w:r>
+        <w:rPr>
+          <w:rStyle w:val="CodeHTML"/>
+          <w:rFonts w:eastAsiaTheme="majorEastAsia"/>
+        </w:rPr>
+        <w:t xml:space="preserve">  // code</w:t>
+      </w:r>
+    </w:p>
+    <w:p>
+      <w:pPr>
+        <w:pStyle w:val="PrformatHTML"/>
+        <w:numPr>
+          <w:ilvl w:val="0"/>
+          <w:numId w:val="5"/>
+        </w:numPr>
+        <w:tabs>
+          <w:tab w:val="clear" w:pos="720"/>
+        </w:tabs>
+        <w:rPr>
+          <w:rStyle w:val="CodeHTML"/>
+          <w:rFonts w:eastAsiaTheme="majorEastAsia"/>
+        </w:rPr>
+      </w:pPr>
+      <w:r>
+        <w:rPr>
+          <w:rStyle w:val="CodeHTML"/>
+          <w:rFonts w:eastAsiaTheme="majorEastAsia"/>
+        </w:rPr>
+        <w:t>} catch (e) {</w:t>
+      </w:r>
+    </w:p>
+    <w:p>
+      <w:pPr>
+        <w:pStyle w:val="PrformatHTML"/>
+        <w:numPr>
+          <w:ilvl w:val="0"/>
+          <w:numId w:val="5"/>
+        </w:numPr>
+        <w:tabs>
+          <w:tab w:val="clear" w:pos="720"/>
+        </w:tabs>
+        <w:rPr>
+          <w:rStyle w:val="CodeHTML"/>
+          <w:rFonts w:eastAsiaTheme="majorEastAsia"/>
+        </w:rPr>
+      </w:pPr>
+      <w:r>
+        <w:rPr>
+          <w:rStyle w:val="CodeHTML"/>
+          <w:rFonts w:eastAsiaTheme="majorEastAsia"/>
+        </w:rPr>
+        <w:t xml:space="preserve">  // gestion d’erreur</w:t>
+      </w:r>
+    </w:p>
+    <w:p>
+      <w:pPr>
+        <w:pStyle w:val="PrformatHTML"/>
+        <w:numPr>
+          <w:ilvl w:val="0"/>
+          <w:numId w:val="5"/>
+        </w:numPr>
+        <w:tabs>
+          <w:tab w:val="clear" w:pos="720"/>
+        </w:tabs>
+        <w:rPr>
+          <w:rStyle w:val="CodeHTML"/>
+          <w:rFonts w:eastAsiaTheme="majorEastAsia"/>
+        </w:rPr>
+      </w:pPr>
+      <w:r>
+        <w:rPr>
+          <w:rStyle w:val="CodeHTML"/>
+          <w:rFonts w:eastAsiaTheme="majorEastAsia"/>
+        </w:rPr>
+        <w:t xml:space="preserve">} </w:t>
+      </w:r>
+      <w:proofErr w:type="spellStart"/>
+      <w:r>
+        <w:rPr>
+          <w:rStyle w:val="CodeHTML"/>
+          <w:rFonts w:eastAsiaTheme="majorEastAsia"/>
+        </w:rPr>
+        <w:t>finally</w:t>
+      </w:r>
+      <w:proofErr w:type="spellEnd"/>
+      <w:r>
+        <w:rPr>
+          <w:rStyle w:val="CodeHTML"/>
+          <w:rFonts w:eastAsiaTheme="majorEastAsia"/>
+        </w:rPr>
+        <w:t xml:space="preserve"> {</w:t>
+      </w:r>
+    </w:p>
+    <w:p>
+      <w:pPr>
+        <w:pStyle w:val="PrformatHTML"/>
+        <w:numPr>
+          <w:ilvl w:val="0"/>
+          <w:numId w:val="5"/>
+        </w:numPr>
+        <w:tabs>
+          <w:tab w:val="clear" w:pos="720"/>
+        </w:tabs>
+        <w:rPr>
+          <w:rStyle w:val="CodeHTML"/>
+          <w:rFonts w:eastAsiaTheme="majorEastAsia"/>
+        </w:rPr>
+      </w:pPr>
+      <w:r>
+        <w:rPr>
+          <w:rStyle w:val="CodeHTML"/>
+          <w:rFonts w:eastAsiaTheme="majorEastAsia"/>
+        </w:rPr>
+        <w:t xml:space="preserve">  // toujours exécuté</w:t>
+      </w:r>
+    </w:p>
+    <w:p>
+      <w:pPr>
+        <w:pStyle w:val="PrformatHTML"/>
+        <w:numPr>
+          <w:ilvl w:val="0"/>
+          <w:numId w:val="5"/>
+        </w:numPr>
+        <w:tabs>
+          <w:tab w:val="clear" w:pos="720"/>
+        </w:tabs>
+        <w:rPr>
+          <w:rStyle w:val="CodeHTML"/>
+          <w:rFonts w:eastAsiaTheme="majorEastAsia"/>
+        </w:rPr>
+      </w:pPr>
+      <w:r>
+        <w:rPr>
+          <w:rStyle w:val="CodeHTML"/>
+          <w:rFonts w:eastAsiaTheme="majorEastAsia"/>
+        </w:rPr>
+        <w:t>}</w:t>
+      </w:r>
+    </w:p>
+    <w:p>
+      <w:pPr>
+        <w:pStyle w:val="NormalWeb"/>
+        <w:numPr>
+          <w:ilvl w:val="0"/>
+          <w:numId w:val="5"/>
+        </w:numPr>
+      </w:pPr>
+      <w:r>
+        <w:rPr>
+          <w:rStyle w:val="lev"/>
+        </w:rPr>
+        <w:t xml:space="preserve">L’opérateur </w:t>
+      </w:r>
+      <w:proofErr w:type="spellStart"/>
+      <w:r>
+        <w:rPr>
+          <w:rStyle w:val="CodeHTML"/>
+          <w:rFonts w:eastAsiaTheme="majorEastAsia"/>
+          <w:b/>
+          <w:bCs/>
+        </w:rPr>
+        <w:t>throw</w:t>
+      </w:r>
+      <w:proofErr w:type="spellEnd"/>
+      <w:r>
+        <w:br/>
+        <w:t>C’est toi qui peux déclencher une exception volontairement. Utile pour valider des conditions et signaler un problème clairement.</w:t>
+      </w:r>
+    </w:p>
+    <w:p>
+      <w:pPr>
+        <w:pStyle w:val="PrformatHTML"/>
+        <w:numPr>
+          <w:ilvl w:val="0"/>
+          <w:numId w:val="5"/>
+        </w:numPr>
+        <w:tabs>
+          <w:tab w:val="clear" w:pos="720"/>
+        </w:tabs>
+        <w:rPr>
+          <w:rStyle w:val="CodeHTML"/>
+          <w:rFonts w:eastAsiaTheme="majorEastAsia"/>
+        </w:rPr>
+      </w:pPr>
+      <w:proofErr w:type="spellStart"/>
+      <w:proofErr w:type="gramStart"/>
+      <w:r>
+        <w:rPr>
+          <w:rStyle w:val="CodeHTML"/>
+          <w:rFonts w:eastAsiaTheme="majorEastAsia"/>
+        </w:rPr>
+        <w:t>function</w:t>
+      </w:r>
+      <w:proofErr w:type="spellEnd"/>
+      <w:proofErr w:type="gramEnd"/>
+      <w:r>
+        <w:rPr>
+          <w:rStyle w:val="CodeHTML"/>
+          <w:rFonts w:eastAsiaTheme="majorEastAsia"/>
+        </w:rPr>
+        <w:t xml:space="preserve"> diviser(a, b) {</w:t>
+      </w:r>
+    </w:p>
+    <w:p>
+      <w:pPr>
+        <w:pStyle w:val="PrformatHTML"/>
+        <w:numPr>
+          <w:ilvl w:val="0"/>
+          <w:numId w:val="5"/>
+        </w:numPr>
+        <w:tabs>
+          <w:tab w:val="clear" w:pos="720"/>
+        </w:tabs>
+        <w:rPr>
+          <w:rStyle w:val="CodeHTML"/>
+          <w:rFonts w:eastAsiaTheme="majorEastAsia"/>
+        </w:rPr>
+      </w:pPr>
+      <w:r>
+        <w:rPr>
+          <w:rStyle w:val="CodeHTML"/>
+          <w:rFonts w:eastAsiaTheme="majorEastAsia"/>
+        </w:rPr>
+        <w:t xml:space="preserve">  </w:t>
+      </w:r>
+      <w:proofErr w:type="gramStart"/>
+      <w:r>
+        <w:rPr>
+          <w:rStyle w:val="CodeHTML"/>
+          <w:rFonts w:eastAsiaTheme="majorEastAsia"/>
+        </w:rPr>
+        <w:t>if</w:t>
+      </w:r>
+      <w:proofErr w:type="gramEnd"/>
+      <w:r>
+        <w:rPr>
+          <w:rStyle w:val="CodeHTML"/>
+          <w:rFonts w:eastAsiaTheme="majorEastAsia"/>
+        </w:rPr>
+        <w:t xml:space="preserve"> (b === 0) {</w:t>
+      </w:r>
+    </w:p>
+    <w:p>
+      <w:pPr>
+        <w:pStyle w:val="PrformatHTML"/>
+        <w:numPr>
+          <w:ilvl w:val="0"/>
+          <w:numId w:val="5"/>
+        </w:numPr>
+        <w:tabs>
+          <w:tab w:val="clear" w:pos="720"/>
+        </w:tabs>
+        <w:rPr>
+          <w:rStyle w:val="CodeHTML"/>
+          <w:rFonts w:eastAsiaTheme="majorEastAsia"/>
+        </w:rPr>
+      </w:pPr>
+      <w:r>
+        <w:rPr>
+          <w:rStyle w:val="CodeHTML"/>
+          <w:rFonts w:eastAsiaTheme="majorEastAsia"/>
+        </w:rPr>
+        <w:t xml:space="preserve">    </w:t>
+      </w:r>
+      <w:proofErr w:type="spellStart"/>
+      <w:proofErr w:type="gramStart"/>
+      <w:r>
+        <w:rPr>
+          <w:rStyle w:val="CodeHTML"/>
+          <w:rFonts w:eastAsiaTheme="majorEastAsia"/>
+        </w:rPr>
+        <w:t>throw</w:t>
+      </w:r>
+      <w:proofErr w:type="spellEnd"/>
+      <w:proofErr w:type="gramEnd"/>
+      <w:r>
+        <w:rPr>
+          <w:rStyle w:val="CodeHTML"/>
+          <w:rFonts w:eastAsiaTheme="majorEastAsia"/>
+        </w:rPr>
+        <w:t xml:space="preserve"> new </w:t>
+      </w:r>
+      <w:proofErr w:type="spellStart"/>
+      <w:r>
+        <w:rPr>
+          <w:rStyle w:val="CodeHTML"/>
+          <w:rFonts w:eastAsiaTheme="majorEastAsia"/>
+        </w:rPr>
+        <w:t>Error</w:t>
+      </w:r>
+      <w:proofErr w:type="spellEnd"/>
+      <w:r>
+        <w:rPr>
+          <w:rStyle w:val="CodeHTML"/>
+          <w:rFonts w:eastAsiaTheme="majorEastAsia"/>
+        </w:rPr>
+        <w:t>("Division par zéro interdite !");</w:t>
+      </w:r>
+    </w:p>
+    <w:p>
+      <w:pPr>
+        <w:pStyle w:val="PrformatHTML"/>
+        <w:numPr>
+          <w:ilvl w:val="0"/>
+          <w:numId w:val="5"/>
+        </w:numPr>
+        <w:tabs>
+          <w:tab w:val="clear" w:pos="720"/>
+        </w:tabs>
+        <w:rPr>
+          <w:rStyle w:val="CodeHTML"/>
+          <w:rFonts w:eastAsiaTheme="majorEastAsia"/>
+        </w:rPr>
+      </w:pPr>
+      <w:r>
+        <w:rPr>
+          <w:rStyle w:val="CodeHTML"/>
+          <w:rFonts w:eastAsiaTheme="majorEastAsia"/>
+        </w:rPr>
+        <w:t xml:space="preserve">  }</w:t>
+      </w:r>
+    </w:p>
+    <w:p>
+      <w:pPr>
+        <w:pStyle w:val="PrformatHTML"/>
+        <w:numPr>
+          <w:ilvl w:val="0"/>
+          <w:numId w:val="5"/>
+        </w:numPr>
+        <w:tabs>
+          <w:tab w:val="clear" w:pos="720"/>
+        </w:tabs>
+        <w:rPr>
+          <w:rStyle w:val="CodeHTML"/>
+          <w:rFonts w:eastAsiaTheme="majorEastAsia"/>
+        </w:rPr>
+      </w:pPr>
+      <w:r>
+        <w:rPr>
+          <w:rStyle w:val="CodeHTML"/>
+          <w:rFonts w:eastAsiaTheme="majorEastAsia"/>
+        </w:rPr>
+        <w:t xml:space="preserve">  </w:t>
+      </w:r>
+      <w:proofErr w:type="gramStart"/>
+      <w:r>
+        <w:rPr>
+          <w:rStyle w:val="CodeHTML"/>
+          <w:rFonts w:eastAsiaTheme="majorEastAsia"/>
+        </w:rPr>
+        <w:t>return</w:t>
+      </w:r>
+      <w:proofErr w:type="gramEnd"/>
+      <w:r>
+        <w:rPr>
+          <w:rStyle w:val="CodeHTML"/>
+          <w:rFonts w:eastAsiaTheme="majorEastAsia"/>
+        </w:rPr>
+        <w:t xml:space="preserve"> a / b;</w:t>
+      </w:r>
+    </w:p>
+    <w:p>
+      <w:pPr>
+        <w:pStyle w:val="PrformatHTML"/>
+        <w:numPr>
+          <w:ilvl w:val="0"/>
+          <w:numId w:val="5"/>
+        </w:numPr>
+        <w:tabs>
+          <w:tab w:val="clear" w:pos="720"/>
+        </w:tabs>
+        <w:rPr>
+          <w:rStyle w:val="CodeHTML"/>
+          <w:rFonts w:eastAsiaTheme="majorEastAsia"/>
+        </w:rPr>
+      </w:pPr>
+      <w:r>
+        <w:rPr>
+          <w:rStyle w:val="CodeHTML"/>
+          <w:rFonts w:eastAsiaTheme="majorEastAsia"/>
+        </w:rPr>
+        <w:t>}</w:t>
+      </w:r>
+    </w:p>
+    <w:p>
+      <w:pPr>
+        <w:pStyle w:val="NormalWeb"/>
+      </w:pPr>
+      <w:r>
+        <w:rPr>
+          <w:rStyle w:val="lev"/>
+        </w:rPr>
+        <w:t>En résumé</w:t>
+      </w:r>
+      <w:r>
+        <w:br/>
+        <w:t xml:space="preserve">Les exceptions te permettent de contrôler les erreurs sans crasher tes programmes. Avec </w:t>
+      </w:r>
+      <w:proofErr w:type="spellStart"/>
+      <w:r>
+        <w:rPr>
+          <w:rStyle w:val="CodeHTML"/>
+          <w:rFonts w:eastAsiaTheme="majorEastAsia"/>
+        </w:rPr>
+        <w:t>try</w:t>
+      </w:r>
+      <w:proofErr w:type="spellEnd"/>
+      <w:r>
+        <w:rPr>
+          <w:rStyle w:val="CodeHTML"/>
+          <w:rFonts w:eastAsiaTheme="majorEastAsia"/>
+        </w:rPr>
+        <w:t>…catch…</w:t>
+      </w:r>
+      <w:proofErr w:type="spellStart"/>
+      <w:r>
+        <w:rPr>
+          <w:rStyle w:val="CodeHTML"/>
+          <w:rFonts w:eastAsiaTheme="majorEastAsia"/>
+        </w:rPr>
+        <w:t>finally</w:t>
+      </w:r>
+      <w:proofErr w:type="spellEnd"/>
+      <w:r>
+        <w:t xml:space="preserve"> tu encadres, captures et assures le nettoyage, et avec </w:t>
+      </w:r>
+      <w:proofErr w:type="spellStart"/>
+      <w:r>
+        <w:rPr>
+          <w:rStyle w:val="CodeHTML"/>
+          <w:rFonts w:eastAsiaTheme="majorEastAsia"/>
+        </w:rPr>
+        <w:t>throw</w:t>
+      </w:r>
+      <w:proofErr w:type="spellEnd"/>
+      <w:r>
+        <w:t xml:space="preserve"> tu imposes tes propres règles de validation. À toi de jouer !</w:t>
+      </w:r>
+    </w:p>
+    <w:p>
+      <w:pPr>
         <w:tabs>
           <w:tab w:val="left" w:pos="1422"/>
         </w:tabs>
       </w:pPr>
       <w:r>
-        <w:tab/>
-      </w:r>
-      <w:bookmarkStart w:id="0" w:name="_GoBack"/>
-      <w:bookmarkEnd w:id="0"/>
+        <w:rPr>
+          <w:noProof/>
+          <w:lang w:eastAsia="fr-FR"/>
+        </w:rPr>
+        <w:drawing>
+          <wp:inline distT="0" distB="0" distL="0" distR="0">
+            <wp:extent cx="3149600" cy="5139055"/>
+            <wp:effectExtent l="0" t="0" r="0" b="4445"/>
+            <wp:docPr id="1" name="Image 1" descr="try, catch, finally"/>
+            <wp:cNvGraphicFramePr>
+              <a:graphicFrameLocks xmlns:a="http://schemas.openxmlformats.org/drawingml/2006/main" noChangeAspect="1"/>
+            </wp:cNvGraphicFramePr>
+            <a:graphic xmlns:a="http://schemas.openxmlformats.org/drawingml/2006/main">
+              <a:graphicData uri="http://schemas.openxmlformats.org/drawingml/2006/picture">
+                <pic:pic xmlns:pic="http://schemas.openxmlformats.org/drawingml/2006/picture">
+                  <pic:nvPicPr>
+                    <pic:cNvPr id="0" name="Picture 1" descr="try, catch, finally"/>
+                    <pic:cNvPicPr>
+                      <a:picLocks noChangeAspect="1" noChangeArrowheads="1"/>
+                    </pic:cNvPicPr>
+                  </pic:nvPicPr>
+                  <pic:blipFill>
+                    <a:blip r:embed="rId5">
+                      <a:extLst>
+                        <a:ext uri="{28A0092B-C50C-407E-A947-70E740481C1C}">
+                          <a14:useLocalDpi xmlns:a14="http://schemas.microsoft.com/office/drawing/2010/main" val="0"/>
+                        </a:ext>
+                      </a:extLst>
+                    </a:blip>
+                    <a:srcRect/>
+                    <a:stretch>
+                      <a:fillRect/>
+                    </a:stretch>
+                  </pic:blipFill>
+                  <pic:spPr bwMode="auto">
+                    <a:xfrm>
+                      <a:off x="0" y="0"/>
+                      <a:ext cx="3149600" cy="5139055"/>
+                    </a:xfrm>
+                    <a:prstGeom prst="rect">
+                      <a:avLst/>
+                    </a:prstGeom>
+                    <a:noFill/>
+                    <a:ln>
+                      <a:noFill/>
+                    </a:ln>
+                  </pic:spPr>
+                </pic:pic>
+              </a:graphicData>
+            </a:graphic>
+          </wp:inline>
+        </w:drawing>
+      </w:r>
+    </w:p>
+    <w:p>
+      <w:pPr>
+        <w:pStyle w:val="Titre1"/>
+        <w:rPr>
+          <w:rFonts w:ascii="Times New Roman" w:eastAsia="Times New Roman" w:hAnsi="Times New Roman" w:cs="Times New Roman"/>
+          <w:sz w:val="24"/>
+          <w:szCs w:val="24"/>
+          <w:lang w:eastAsia="fr-FR"/>
+        </w:rPr>
+      </w:pPr>
+      <w:r>
+        <w:rPr>
+          <w:rStyle w:val="lev"/>
+        </w:rPr>
+        <w:lastRenderedPageBreak/>
+        <w:t xml:space="preserve">Expression </w:t>
+      </w:r>
+      <w:proofErr w:type="spellStart"/>
+      <w:r>
+        <w:rPr>
+          <w:rStyle w:val="lev"/>
+        </w:rPr>
+        <w:t>Reguliere</w:t>
+      </w:r>
+      <w:proofErr w:type="spellEnd"/>
+    </w:p>
+    <w:p>
+      <w:pPr>
+        <w:pStyle w:val="NormalWeb"/>
+      </w:pPr>
+      <w:r>
+        <w:t>Voici un résumé simple et direct :</w:t>
+      </w:r>
+    </w:p>
+    <w:p>
+      <w:pPr>
+        <w:pStyle w:val="NormalWeb"/>
+        <w:numPr>
+          <w:ilvl w:val="0"/>
+          <w:numId w:val="6"/>
+        </w:numPr>
+      </w:pPr>
+      <w:r>
+        <w:rPr>
+          <w:rStyle w:val="lev"/>
+        </w:rPr>
+        <w:t>Qu’est-ce qu’une expression rationnelle (</w:t>
+      </w:r>
+      <w:proofErr w:type="spellStart"/>
+      <w:r>
+        <w:rPr>
+          <w:rStyle w:val="lev"/>
+        </w:rPr>
+        <w:t>RegEx</w:t>
+      </w:r>
+      <w:proofErr w:type="spellEnd"/>
+      <w:r>
+        <w:rPr>
+          <w:rStyle w:val="lev"/>
+        </w:rPr>
+        <w:t>) ?</w:t>
+      </w:r>
+      <w:r>
+        <w:br/>
+        <w:t>Un outil puissant pour chercher, valider ou extraire des motifs de texte grâce à des patterns (séquences de caractères spéciaux).</w:t>
+      </w:r>
+    </w:p>
+    <w:p>
+      <w:pPr>
+        <w:pStyle w:val="NormalWeb"/>
+        <w:numPr>
+          <w:ilvl w:val="0"/>
+          <w:numId w:val="6"/>
+        </w:numPr>
+      </w:pPr>
+      <w:r>
+        <w:rPr>
+          <w:rStyle w:val="lev"/>
+        </w:rPr>
+        <w:t>Documents PDF à télécharger</w:t>
+      </w:r>
+      <w:r>
+        <w:br/>
+        <w:t>Des guides complets au format PDF pour approfondir la syntaxe, les quantificateurs, les classes de caractères, etc.</w:t>
+      </w:r>
+    </w:p>
+    <w:p>
+      <w:pPr>
+        <w:pStyle w:val="NormalWeb"/>
+        <w:numPr>
+          <w:ilvl w:val="0"/>
+          <w:numId w:val="6"/>
+        </w:numPr>
+      </w:pPr>
+      <w:r>
+        <w:rPr>
+          <w:rStyle w:val="lev"/>
+        </w:rPr>
+        <w:t xml:space="preserve">Exemple avec </w:t>
+      </w:r>
+      <w:proofErr w:type="spellStart"/>
+      <w:r>
+        <w:rPr>
+          <w:rStyle w:val="lev"/>
+        </w:rPr>
+        <w:t>RegEx</w:t>
+      </w:r>
+      <w:proofErr w:type="spellEnd"/>
+      <w:r>
+        <w:br/>
+        <w:t xml:space="preserve">Un pattern concret (par exemple </w:t>
+      </w:r>
+      <w:r>
+        <w:rPr>
+          <w:rStyle w:val="CodeHTML"/>
+          <w:rFonts w:eastAsiaTheme="majorEastAsia"/>
+        </w:rPr>
+        <w:t>\d{3}-\d{2}-\d{4}</w:t>
+      </w:r>
+      <w:r>
+        <w:t>) pour illustrer comment on recherche une suite de chiffres selon un format précis.</w:t>
+      </w:r>
+    </w:p>
+    <w:p>
+      <w:pPr>
+        <w:pStyle w:val="NormalWeb"/>
+        <w:numPr>
+          <w:ilvl w:val="0"/>
+          <w:numId w:val="6"/>
+        </w:numPr>
+      </w:pPr>
+      <w:r>
+        <w:rPr>
+          <w:rStyle w:val="lev"/>
+        </w:rPr>
+        <w:t>Exemple expliqué</w:t>
+      </w:r>
+      <w:r>
+        <w:br/>
+        <w:t>Décryptage du pattern :</w:t>
+      </w:r>
+    </w:p>
+    <w:p>
+      <w:pPr>
+        <w:pStyle w:val="NormalWeb"/>
+        <w:numPr>
+          <w:ilvl w:val="1"/>
+          <w:numId w:val="6"/>
+        </w:numPr>
+      </w:pPr>
+      <w:r>
+        <w:rPr>
+          <w:rStyle w:val="CodeHTML"/>
+          <w:rFonts w:eastAsiaTheme="majorEastAsia"/>
+        </w:rPr>
+        <w:t>\</w:t>
+      </w:r>
+      <w:proofErr w:type="gramStart"/>
+      <w:r>
+        <w:rPr>
+          <w:rStyle w:val="CodeHTML"/>
+          <w:rFonts w:eastAsiaTheme="majorEastAsia"/>
+        </w:rPr>
+        <w:t>d{</w:t>
+      </w:r>
+      <w:proofErr w:type="gramEnd"/>
+      <w:r>
+        <w:rPr>
+          <w:rStyle w:val="CodeHTML"/>
+          <w:rFonts w:eastAsiaTheme="majorEastAsia"/>
+        </w:rPr>
+        <w:t>3}</w:t>
+      </w:r>
+      <w:r>
+        <w:t xml:space="preserve"> → trois chiffres</w:t>
+      </w:r>
+    </w:p>
+    <w:p>
+      <w:pPr>
+        <w:pStyle w:val="NormalWeb"/>
+        <w:numPr>
+          <w:ilvl w:val="1"/>
+          <w:numId w:val="6"/>
+        </w:numPr>
+      </w:pPr>
+      <w:r>
+        <w:rPr>
+          <w:rStyle w:val="CodeHTML"/>
+          <w:rFonts w:eastAsiaTheme="majorEastAsia"/>
+        </w:rPr>
+        <w:t>-</w:t>
+      </w:r>
+      <w:r>
+        <w:t xml:space="preserve"> → un tiret</w:t>
+      </w:r>
+    </w:p>
+    <w:p>
+      <w:pPr>
+        <w:pStyle w:val="NormalWeb"/>
+        <w:numPr>
+          <w:ilvl w:val="1"/>
+          <w:numId w:val="6"/>
+        </w:numPr>
+      </w:pPr>
+      <w:r>
+        <w:rPr>
+          <w:rStyle w:val="CodeHTML"/>
+          <w:rFonts w:eastAsiaTheme="majorEastAsia"/>
+        </w:rPr>
+        <w:t>\</w:t>
+      </w:r>
+      <w:proofErr w:type="gramStart"/>
+      <w:r>
+        <w:rPr>
+          <w:rStyle w:val="CodeHTML"/>
+          <w:rFonts w:eastAsiaTheme="majorEastAsia"/>
+        </w:rPr>
+        <w:t>d{</w:t>
+      </w:r>
+      <w:proofErr w:type="gramEnd"/>
+      <w:r>
+        <w:rPr>
+          <w:rStyle w:val="CodeHTML"/>
+          <w:rFonts w:eastAsiaTheme="majorEastAsia"/>
+        </w:rPr>
+        <w:t>2}</w:t>
+      </w:r>
+      <w:r>
+        <w:t xml:space="preserve"> → deux chiffres</w:t>
+      </w:r>
+    </w:p>
+    <w:p>
+      <w:pPr>
+        <w:pStyle w:val="NormalWeb"/>
+        <w:numPr>
+          <w:ilvl w:val="1"/>
+          <w:numId w:val="6"/>
+        </w:numPr>
+      </w:pPr>
+      <w:r>
+        <w:rPr>
+          <w:rStyle w:val="CodeHTML"/>
+          <w:rFonts w:eastAsiaTheme="majorEastAsia"/>
+        </w:rPr>
+        <w:t>-</w:t>
+      </w:r>
+      <w:r>
+        <w:t xml:space="preserve"> → un tiret</w:t>
+      </w:r>
+    </w:p>
+    <w:p>
+      <w:pPr>
+        <w:pStyle w:val="NormalWeb"/>
+        <w:numPr>
+          <w:ilvl w:val="1"/>
+          <w:numId w:val="6"/>
+        </w:numPr>
+      </w:pPr>
+      <w:r>
+        <w:rPr>
+          <w:rStyle w:val="CodeHTML"/>
+          <w:rFonts w:eastAsiaTheme="majorEastAsia"/>
+        </w:rPr>
+        <w:t>\</w:t>
+      </w:r>
+      <w:proofErr w:type="gramStart"/>
+      <w:r>
+        <w:rPr>
+          <w:rStyle w:val="CodeHTML"/>
+          <w:rFonts w:eastAsiaTheme="majorEastAsia"/>
+        </w:rPr>
+        <w:t>d{</w:t>
+      </w:r>
+      <w:proofErr w:type="gramEnd"/>
+      <w:r>
+        <w:rPr>
+          <w:rStyle w:val="CodeHTML"/>
+          <w:rFonts w:eastAsiaTheme="majorEastAsia"/>
+        </w:rPr>
+        <w:t>4}</w:t>
+      </w:r>
+      <w:r>
+        <w:t xml:space="preserve"> → quatre chiffres</w:t>
+      </w:r>
+    </w:p>
+    <w:p>
+      <w:pPr>
+        <w:pStyle w:val="NormalWeb"/>
+        <w:numPr>
+          <w:ilvl w:val="0"/>
+          <w:numId w:val="6"/>
+        </w:numPr>
+      </w:pPr>
+      <w:proofErr w:type="spellStart"/>
+      <w:r>
+        <w:rPr>
+          <w:rStyle w:val="lev"/>
+        </w:rPr>
+        <w:t>RegEx</w:t>
+      </w:r>
+      <w:proofErr w:type="spellEnd"/>
+      <w:r>
+        <w:rPr>
+          <w:rStyle w:val="lev"/>
+        </w:rPr>
+        <w:t xml:space="preserve"> Exemple 2 : Tester une adresse email</w:t>
+      </w:r>
+      <w:r>
+        <w:br/>
+        <w:t>Un pattern courant pour valider un email comme :</w:t>
+      </w:r>
+    </w:p>
+    <w:p>
+      <w:pPr>
+        <w:pStyle w:val="PrformatHTML"/>
+        <w:numPr>
+          <w:ilvl w:val="0"/>
+          <w:numId w:val="6"/>
+        </w:numPr>
+        <w:tabs>
+          <w:tab w:val="clear" w:pos="720"/>
+        </w:tabs>
+        <w:rPr>
+          <w:rStyle w:val="CodeHTML"/>
+          <w:rFonts w:eastAsiaTheme="majorEastAsia"/>
+        </w:rPr>
+      </w:pPr>
+      <w:r>
+        <w:rPr>
+          <w:rStyle w:val="CodeHTML"/>
+          <w:rFonts w:eastAsiaTheme="majorEastAsia"/>
+        </w:rPr>
+        <w:t>/^[a-zA-Z0-</w:t>
+      </w:r>
+      <w:proofErr w:type="gramStart"/>
+      <w:r>
+        <w:rPr>
+          <w:rStyle w:val="CodeHTML"/>
+          <w:rFonts w:eastAsiaTheme="majorEastAsia"/>
+        </w:rPr>
+        <w:t>9._</w:t>
+      </w:r>
+      <w:proofErr w:type="gramEnd"/>
+      <w:r>
+        <w:rPr>
+          <w:rStyle w:val="CodeHTML"/>
+          <w:rFonts w:eastAsiaTheme="majorEastAsia"/>
+        </w:rPr>
+        <w:t>%+-]+@[a-zA-Z0-9.-]+\.[a-</w:t>
+      </w:r>
+      <w:proofErr w:type="spellStart"/>
+      <w:r>
+        <w:rPr>
+          <w:rStyle w:val="CodeHTML"/>
+          <w:rFonts w:eastAsiaTheme="majorEastAsia"/>
+        </w:rPr>
+        <w:t>zA</w:t>
+      </w:r>
+      <w:proofErr w:type="spellEnd"/>
+      <w:r>
+        <w:rPr>
+          <w:rStyle w:val="CodeHTML"/>
+          <w:rFonts w:eastAsiaTheme="majorEastAsia"/>
+        </w:rPr>
+        <w:t>-Z]{2,}$/</w:t>
+      </w:r>
+    </w:p>
+    <w:p>
+      <w:pPr>
+        <w:pStyle w:val="NormalWeb"/>
+        <w:numPr>
+          <w:ilvl w:val="1"/>
+          <w:numId w:val="6"/>
+        </w:numPr>
+      </w:pPr>
+      <w:r>
+        <w:t xml:space="preserve">Avant le </w:t>
+      </w:r>
+      <w:r>
+        <w:rPr>
+          <w:rStyle w:val="CodeHTML"/>
+          <w:rFonts w:eastAsiaTheme="majorEastAsia"/>
+        </w:rPr>
+        <w:t>@</w:t>
+      </w:r>
+      <w:r>
+        <w:t xml:space="preserve"> : lettres, chiffres, points, tirets…</w:t>
+      </w:r>
+    </w:p>
+    <w:p>
+      <w:pPr>
+        <w:pStyle w:val="NormalWeb"/>
+        <w:numPr>
+          <w:ilvl w:val="1"/>
+          <w:numId w:val="6"/>
+        </w:numPr>
+      </w:pPr>
+      <w:r>
+        <w:t xml:space="preserve">Après le </w:t>
+      </w:r>
+      <w:r>
+        <w:rPr>
+          <w:rStyle w:val="CodeHTML"/>
+          <w:rFonts w:eastAsiaTheme="majorEastAsia"/>
+        </w:rPr>
+        <w:t>@</w:t>
+      </w:r>
+      <w:r>
+        <w:t xml:space="preserve"> : domaine avec un point et extension (au moins 2 lettres).</w:t>
+      </w:r>
+    </w:p>
+    <w:p>
+      <w:pPr>
+        <w:pStyle w:val="NormalWeb"/>
+      </w:pPr>
+      <w:r>
+        <w:rPr>
+          <w:rStyle w:val="lev"/>
+        </w:rPr>
+        <w:t>En résumé</w:t>
+      </w:r>
+      <w:r>
+        <w:br/>
+        <w:t xml:space="preserve">Les expressions régulières te donnent le </w:t>
+      </w:r>
+      <w:proofErr w:type="spellStart"/>
+      <w:r>
+        <w:t>super-pouvoir</w:t>
+      </w:r>
+      <w:proofErr w:type="spellEnd"/>
+      <w:r>
+        <w:t xml:space="preserve"> de dénicher ou valider n’importe quel motif de texte. Avec les </w:t>
+      </w:r>
+      <w:proofErr w:type="spellStart"/>
+      <w:r>
+        <w:t>PDFs</w:t>
+      </w:r>
+      <w:proofErr w:type="spellEnd"/>
+      <w:r>
+        <w:t>, tu as la référence, et grâce aux exemples commentés, tu passes de l’apprentissage à la pratique en un clin d’œil !</w:t>
+      </w:r>
+    </w:p>
+    <w:p>
+      <w:pPr>
+        <w:tabs>
+          <w:tab w:val="left" w:pos="1422"/>
+        </w:tabs>
+      </w:pPr>
     </w:p>
     <w:sectPr>
       <w:pgSz w:w="11906" w:h="16838"/>
@@ -415,9 +3503,9 @@
 <file path=word/numbering.xml><?xml version="1.0" encoding="utf-8"?>
 <w:numbering xmlns:wpc="http://schemas.microsoft.com/office/word/2010/wordprocessingCanvas" xmlns:cx="http://schemas.microsoft.com/office/drawing/2014/chartex" xmlns:cx1="http://schemas.microsoft.com/office/drawing/2015/9/8/chartex" xmlns:mc="http://schemas.openxmlformats.org/markup-compatibility/2006" xmlns:o="urn:schemas-microsoft-com:office:office" xmlns:r="http://schemas.openxmlformats.org/officeDocument/2006/relationships" xmlns:m="http://schemas.openxmlformats.org/officeDocument/2006/math" xmlns:v="urn:schemas-microsoft-com:vml" xmlns:wp14="http://schemas.microsoft.com/office/word/2010/wordprocessingDrawing" xmlns:wp="http://schemas.openxmlformats.org/drawingml/2006/wordprocessingDrawing" xmlns:w10="urn:schemas-microsoft-com:office:word" xmlns:w="http://schemas.openxmlformats.org/wordprocessingml/2006/main" xmlns:w14="http://schemas.microsoft.com/office/word/2010/wordml" xmlns:w15="http://schemas.microsoft.com/office/word/2012/wordml" xmlns:w16se="http://schemas.microsoft.com/office/word/2015/wordml/symex" xmlns:wpg="http://schemas.microsoft.com/office/word/2010/wordprocessingGroup" xmlns:wpi="http://schemas.microsoft.com/office/word/2010/wordprocessingInk" xmlns:wne="http://schemas.microsoft.com/office/word/2006/wordml" xmlns:wps="http://schemas.microsoft.com/office/word/2010/wordprocessingShape" mc:Ignorable="w14 w15 w16se wp14">
   <w:abstractNum w:abstractNumId="0" w15:restartNumberingAfterBreak="0">
-    <w:nsid w:val="7FF7026F"/>
+    <w:nsid w:val="03197FFD"/>
     <w:multiLevelType w:val="multilevel"/>
-    <w:tmpl w:val="F5A434E0"/>
+    <w:tmpl w:val="E2C060A0"/>
     <w:lvl w:ilvl="0">
       <w:start w:val="1"/>
       <w:numFmt w:val="bullet"/>
@@ -563,11 +3651,458 @@
       </w:rPr>
     </w:lvl>
   </w:abstractNum>
+  <w:abstractNum w:abstractNumId="1" w15:restartNumberingAfterBreak="0">
+    <w:nsid w:val="3A230746"/>
+    <w:multiLevelType w:val="multilevel"/>
+    <w:tmpl w:val="57BA129C"/>
+    <w:lvl w:ilvl="0">
+      <w:start w:val="1"/>
+      <w:numFmt w:val="bullet"/>
+      <w:lvlText w:val=""/>
+      <w:lvlJc w:val="left"/>
+      <w:pPr>
+        <w:tabs>
+          <w:tab w:val="num" w:pos="720"/>
+        </w:tabs>
+        <w:ind w:left="720" w:hanging="360"/>
+      </w:pPr>
+      <w:rPr>
+        <w:rFonts w:ascii="Symbol" w:hAnsi="Symbol" w:hint="default"/>
+        <w:sz w:val="20"/>
+      </w:rPr>
+    </w:lvl>
+    <w:lvl w:ilvl="1">
+      <w:start w:val="1"/>
+      <w:numFmt w:val="bullet"/>
+      <w:lvlText w:val="o"/>
+      <w:lvlJc w:val="left"/>
+      <w:pPr>
+        <w:tabs>
+          <w:tab w:val="num" w:pos="1440"/>
+        </w:tabs>
+        <w:ind w:left="1440" w:hanging="360"/>
+      </w:pPr>
+      <w:rPr>
+        <w:rFonts w:ascii="Courier New" w:hAnsi="Courier New" w:hint="default"/>
+        <w:sz w:val="20"/>
+      </w:rPr>
+    </w:lvl>
+    <w:lvl w:ilvl="2">
+      <w:start w:val="1"/>
+      <w:numFmt w:val="bullet"/>
+      <w:lvlText w:val=""/>
+      <w:lvlJc w:val="left"/>
+      <w:pPr>
+        <w:tabs>
+          <w:tab w:val="num" w:pos="2160"/>
+        </w:tabs>
+        <w:ind w:left="2160" w:hanging="360"/>
+      </w:pPr>
+      <w:rPr>
+        <w:rFonts w:ascii="Wingdings" w:hAnsi="Wingdings" w:hint="default"/>
+        <w:sz w:val="20"/>
+      </w:rPr>
+    </w:lvl>
+    <w:lvl w:ilvl="3" w:tentative="1">
+      <w:start w:val="1"/>
+      <w:numFmt w:val="bullet"/>
+      <w:lvlText w:val=""/>
+      <w:lvlJc w:val="left"/>
+      <w:pPr>
+        <w:tabs>
+          <w:tab w:val="num" w:pos="2880"/>
+        </w:tabs>
+        <w:ind w:left="2880" w:hanging="360"/>
+      </w:pPr>
+      <w:rPr>
+        <w:rFonts w:ascii="Wingdings" w:hAnsi="Wingdings" w:hint="default"/>
+        <w:sz w:val="20"/>
+      </w:rPr>
+    </w:lvl>
+    <w:lvl w:ilvl="4" w:tentative="1">
+      <w:start w:val="1"/>
+      <w:numFmt w:val="bullet"/>
+      <w:lvlText w:val=""/>
+      <w:lvlJc w:val="left"/>
+      <w:pPr>
+        <w:tabs>
+          <w:tab w:val="num" w:pos="3600"/>
+        </w:tabs>
+        <w:ind w:left="3600" w:hanging="360"/>
+      </w:pPr>
+      <w:rPr>
+        <w:rFonts w:ascii="Wingdings" w:hAnsi="Wingdings" w:hint="default"/>
+        <w:sz w:val="20"/>
+      </w:rPr>
+    </w:lvl>
+    <w:lvl w:ilvl="5" w:tentative="1">
+      <w:start w:val="1"/>
+      <w:numFmt w:val="bullet"/>
+      <w:lvlText w:val=""/>
+      <w:lvlJc w:val="left"/>
+      <w:pPr>
+        <w:tabs>
+          <w:tab w:val="num" w:pos="4320"/>
+        </w:tabs>
+        <w:ind w:left="4320" w:hanging="360"/>
+      </w:pPr>
+      <w:rPr>
+        <w:rFonts w:ascii="Wingdings" w:hAnsi="Wingdings" w:hint="default"/>
+        <w:sz w:val="20"/>
+      </w:rPr>
+    </w:lvl>
+    <w:lvl w:ilvl="6" w:tentative="1">
+      <w:start w:val="1"/>
+      <w:numFmt w:val="bullet"/>
+      <w:lvlText w:val=""/>
+      <w:lvlJc w:val="left"/>
+      <w:pPr>
+        <w:tabs>
+          <w:tab w:val="num" w:pos="5040"/>
+        </w:tabs>
+        <w:ind w:left="5040" w:hanging="360"/>
+      </w:pPr>
+      <w:rPr>
+        <w:rFonts w:ascii="Wingdings" w:hAnsi="Wingdings" w:hint="default"/>
+        <w:sz w:val="20"/>
+      </w:rPr>
+    </w:lvl>
+    <w:lvl w:ilvl="7" w:tentative="1">
+      <w:start w:val="1"/>
+      <w:numFmt w:val="bullet"/>
+      <w:lvlText w:val=""/>
+      <w:lvlJc w:val="left"/>
+      <w:pPr>
+        <w:tabs>
+          <w:tab w:val="num" w:pos="5760"/>
+        </w:tabs>
+        <w:ind w:left="5760" w:hanging="360"/>
+      </w:pPr>
+      <w:rPr>
+        <w:rFonts w:ascii="Wingdings" w:hAnsi="Wingdings" w:hint="default"/>
+        <w:sz w:val="20"/>
+      </w:rPr>
+    </w:lvl>
+    <w:lvl w:ilvl="8" w:tentative="1">
+      <w:start w:val="1"/>
+      <w:numFmt w:val="bullet"/>
+      <w:lvlText w:val=""/>
+      <w:lvlJc w:val="left"/>
+      <w:pPr>
+        <w:tabs>
+          <w:tab w:val="num" w:pos="6480"/>
+        </w:tabs>
+        <w:ind w:left="6480" w:hanging="360"/>
+      </w:pPr>
+      <w:rPr>
+        <w:rFonts w:ascii="Wingdings" w:hAnsi="Wingdings" w:hint="default"/>
+        <w:sz w:val="20"/>
+      </w:rPr>
+    </w:lvl>
+  </w:abstractNum>
+  <w:abstractNum w:abstractNumId="2" w15:restartNumberingAfterBreak="0">
+    <w:nsid w:val="5FD254E6"/>
+    <w:multiLevelType w:val="multilevel"/>
+    <w:tmpl w:val="9B22E656"/>
+    <w:lvl w:ilvl="0">
+      <w:start w:val="1"/>
+      <w:numFmt w:val="bullet"/>
+      <w:lvlText w:val=""/>
+      <w:lvlJc w:val="left"/>
+      <w:pPr>
+        <w:tabs>
+          <w:tab w:val="num" w:pos="720"/>
+        </w:tabs>
+        <w:ind w:left="720" w:hanging="360"/>
+      </w:pPr>
+      <w:rPr>
+        <w:rFonts w:ascii="Symbol" w:hAnsi="Symbol" w:hint="default"/>
+        <w:sz w:val="20"/>
+      </w:rPr>
+    </w:lvl>
+    <w:lvl w:ilvl="1">
+      <w:start w:val="1"/>
+      <w:numFmt w:val="bullet"/>
+      <w:lvlText w:val="o"/>
+      <w:lvlJc w:val="left"/>
+      <w:pPr>
+        <w:tabs>
+          <w:tab w:val="num" w:pos="1440"/>
+        </w:tabs>
+        <w:ind w:left="1440" w:hanging="360"/>
+      </w:pPr>
+      <w:rPr>
+        <w:rFonts w:ascii="Courier New" w:hAnsi="Courier New" w:hint="default"/>
+        <w:sz w:val="20"/>
+      </w:rPr>
+    </w:lvl>
+    <w:lvl w:ilvl="2" w:tentative="1">
+      <w:start w:val="1"/>
+      <w:numFmt w:val="bullet"/>
+      <w:lvlText w:val=""/>
+      <w:lvlJc w:val="left"/>
+      <w:pPr>
+        <w:tabs>
+          <w:tab w:val="num" w:pos="2160"/>
+        </w:tabs>
+        <w:ind w:left="2160" w:hanging="360"/>
+      </w:pPr>
+      <w:rPr>
+        <w:rFonts w:ascii="Wingdings" w:hAnsi="Wingdings" w:hint="default"/>
+        <w:sz w:val="20"/>
+      </w:rPr>
+    </w:lvl>
+    <w:lvl w:ilvl="3" w:tentative="1">
+      <w:start w:val="1"/>
+      <w:numFmt w:val="bullet"/>
+      <w:lvlText w:val=""/>
+      <w:lvlJc w:val="left"/>
+      <w:pPr>
+        <w:tabs>
+          <w:tab w:val="num" w:pos="2880"/>
+        </w:tabs>
+        <w:ind w:left="2880" w:hanging="360"/>
+      </w:pPr>
+      <w:rPr>
+        <w:rFonts w:ascii="Wingdings" w:hAnsi="Wingdings" w:hint="default"/>
+        <w:sz w:val="20"/>
+      </w:rPr>
+    </w:lvl>
+    <w:lvl w:ilvl="4" w:tentative="1">
+      <w:start w:val="1"/>
+      <w:numFmt w:val="bullet"/>
+      <w:lvlText w:val=""/>
+      <w:lvlJc w:val="left"/>
+      <w:pPr>
+        <w:tabs>
+          <w:tab w:val="num" w:pos="3600"/>
+        </w:tabs>
+        <w:ind w:left="3600" w:hanging="360"/>
+      </w:pPr>
+      <w:rPr>
+        <w:rFonts w:ascii="Wingdings" w:hAnsi="Wingdings" w:hint="default"/>
+        <w:sz w:val="20"/>
+      </w:rPr>
+    </w:lvl>
+    <w:lvl w:ilvl="5" w:tentative="1">
+      <w:start w:val="1"/>
+      <w:numFmt w:val="bullet"/>
+      <w:lvlText w:val=""/>
+      <w:lvlJc w:val="left"/>
+      <w:pPr>
+        <w:tabs>
+          <w:tab w:val="num" w:pos="4320"/>
+        </w:tabs>
+        <w:ind w:left="4320" w:hanging="360"/>
+      </w:pPr>
+      <w:rPr>
+        <w:rFonts w:ascii="Wingdings" w:hAnsi="Wingdings" w:hint="default"/>
+        <w:sz w:val="20"/>
+      </w:rPr>
+    </w:lvl>
+    <w:lvl w:ilvl="6" w:tentative="1">
+      <w:start w:val="1"/>
+      <w:numFmt w:val="bullet"/>
+      <w:lvlText w:val=""/>
+      <w:lvlJc w:val="left"/>
+      <w:pPr>
+        <w:tabs>
+          <w:tab w:val="num" w:pos="5040"/>
+        </w:tabs>
+        <w:ind w:left="5040" w:hanging="360"/>
+      </w:pPr>
+      <w:rPr>
+        <w:rFonts w:ascii="Wingdings" w:hAnsi="Wingdings" w:hint="default"/>
+        <w:sz w:val="20"/>
+      </w:rPr>
+    </w:lvl>
+    <w:lvl w:ilvl="7" w:tentative="1">
+      <w:start w:val="1"/>
+      <w:numFmt w:val="bullet"/>
+      <w:lvlText w:val=""/>
+      <w:lvlJc w:val="left"/>
+      <w:pPr>
+        <w:tabs>
+          <w:tab w:val="num" w:pos="5760"/>
+        </w:tabs>
+        <w:ind w:left="5760" w:hanging="360"/>
+      </w:pPr>
+      <w:rPr>
+        <w:rFonts w:ascii="Wingdings" w:hAnsi="Wingdings" w:hint="default"/>
+        <w:sz w:val="20"/>
+      </w:rPr>
+    </w:lvl>
+    <w:lvl w:ilvl="8" w:tentative="1">
+      <w:start w:val="1"/>
+      <w:numFmt w:val="bullet"/>
+      <w:lvlText w:val=""/>
+      <w:lvlJc w:val="left"/>
+      <w:pPr>
+        <w:tabs>
+          <w:tab w:val="num" w:pos="6480"/>
+        </w:tabs>
+        <w:ind w:left="6480" w:hanging="360"/>
+      </w:pPr>
+      <w:rPr>
+        <w:rFonts w:ascii="Wingdings" w:hAnsi="Wingdings" w:hint="default"/>
+        <w:sz w:val="20"/>
+      </w:rPr>
+    </w:lvl>
+  </w:abstractNum>
+  <w:abstractNum w:abstractNumId="3" w15:restartNumberingAfterBreak="0">
+    <w:nsid w:val="7FF7026F"/>
+    <w:multiLevelType w:val="multilevel"/>
+    <w:tmpl w:val="F5A434E0"/>
+    <w:lvl w:ilvl="0">
+      <w:start w:val="1"/>
+      <w:numFmt w:val="bullet"/>
+      <w:lvlText w:val=""/>
+      <w:lvlJc w:val="left"/>
+      <w:pPr>
+        <w:tabs>
+          <w:tab w:val="num" w:pos="720"/>
+        </w:tabs>
+        <w:ind w:left="720" w:hanging="360"/>
+      </w:pPr>
+      <w:rPr>
+        <w:rFonts w:ascii="Symbol" w:hAnsi="Symbol" w:hint="default"/>
+        <w:sz w:val="20"/>
+      </w:rPr>
+    </w:lvl>
+    <w:lvl w:ilvl="1">
+      <w:start w:val="1"/>
+      <w:numFmt w:val="bullet"/>
+      <w:lvlText w:val="o"/>
+      <w:lvlJc w:val="left"/>
+      <w:pPr>
+        <w:tabs>
+          <w:tab w:val="num" w:pos="1440"/>
+        </w:tabs>
+        <w:ind w:left="1440" w:hanging="360"/>
+      </w:pPr>
+      <w:rPr>
+        <w:rFonts w:ascii="Courier New" w:hAnsi="Courier New" w:hint="default"/>
+        <w:sz w:val="20"/>
+      </w:rPr>
+    </w:lvl>
+    <w:lvl w:ilvl="2" w:tentative="1">
+      <w:start w:val="1"/>
+      <w:numFmt w:val="bullet"/>
+      <w:lvlText w:val=""/>
+      <w:lvlJc w:val="left"/>
+      <w:pPr>
+        <w:tabs>
+          <w:tab w:val="num" w:pos="2160"/>
+        </w:tabs>
+        <w:ind w:left="2160" w:hanging="360"/>
+      </w:pPr>
+      <w:rPr>
+        <w:rFonts w:ascii="Wingdings" w:hAnsi="Wingdings" w:hint="default"/>
+        <w:sz w:val="20"/>
+      </w:rPr>
+    </w:lvl>
+    <w:lvl w:ilvl="3" w:tentative="1">
+      <w:start w:val="1"/>
+      <w:numFmt w:val="bullet"/>
+      <w:lvlText w:val=""/>
+      <w:lvlJc w:val="left"/>
+      <w:pPr>
+        <w:tabs>
+          <w:tab w:val="num" w:pos="2880"/>
+        </w:tabs>
+        <w:ind w:left="2880" w:hanging="360"/>
+      </w:pPr>
+      <w:rPr>
+        <w:rFonts w:ascii="Wingdings" w:hAnsi="Wingdings" w:hint="default"/>
+        <w:sz w:val="20"/>
+      </w:rPr>
+    </w:lvl>
+    <w:lvl w:ilvl="4" w:tentative="1">
+      <w:start w:val="1"/>
+      <w:numFmt w:val="bullet"/>
+      <w:lvlText w:val=""/>
+      <w:lvlJc w:val="left"/>
+      <w:pPr>
+        <w:tabs>
+          <w:tab w:val="num" w:pos="3600"/>
+        </w:tabs>
+        <w:ind w:left="3600" w:hanging="360"/>
+      </w:pPr>
+      <w:rPr>
+        <w:rFonts w:ascii="Wingdings" w:hAnsi="Wingdings" w:hint="default"/>
+        <w:sz w:val="20"/>
+      </w:rPr>
+    </w:lvl>
+    <w:lvl w:ilvl="5" w:tentative="1">
+      <w:start w:val="1"/>
+      <w:numFmt w:val="bullet"/>
+      <w:lvlText w:val=""/>
+      <w:lvlJc w:val="left"/>
+      <w:pPr>
+        <w:tabs>
+          <w:tab w:val="num" w:pos="4320"/>
+        </w:tabs>
+        <w:ind w:left="4320" w:hanging="360"/>
+      </w:pPr>
+      <w:rPr>
+        <w:rFonts w:ascii="Wingdings" w:hAnsi="Wingdings" w:hint="default"/>
+        <w:sz w:val="20"/>
+      </w:rPr>
+    </w:lvl>
+    <w:lvl w:ilvl="6" w:tentative="1">
+      <w:start w:val="1"/>
+      <w:numFmt w:val="bullet"/>
+      <w:lvlText w:val=""/>
+      <w:lvlJc w:val="left"/>
+      <w:pPr>
+        <w:tabs>
+          <w:tab w:val="num" w:pos="5040"/>
+        </w:tabs>
+        <w:ind w:left="5040" w:hanging="360"/>
+      </w:pPr>
+      <w:rPr>
+        <w:rFonts w:ascii="Wingdings" w:hAnsi="Wingdings" w:hint="default"/>
+        <w:sz w:val="20"/>
+      </w:rPr>
+    </w:lvl>
+    <w:lvl w:ilvl="7" w:tentative="1">
+      <w:start w:val="1"/>
+      <w:numFmt w:val="bullet"/>
+      <w:lvlText w:val=""/>
+      <w:lvlJc w:val="left"/>
+      <w:pPr>
+        <w:tabs>
+          <w:tab w:val="num" w:pos="5760"/>
+        </w:tabs>
+        <w:ind w:left="5760" w:hanging="360"/>
+      </w:pPr>
+      <w:rPr>
+        <w:rFonts w:ascii="Wingdings" w:hAnsi="Wingdings" w:hint="default"/>
+        <w:sz w:val="20"/>
+      </w:rPr>
+    </w:lvl>
+    <w:lvl w:ilvl="8" w:tentative="1">
+      <w:start w:val="1"/>
+      <w:numFmt w:val="bullet"/>
+      <w:lvlText w:val=""/>
+      <w:lvlJc w:val="left"/>
+      <w:pPr>
+        <w:tabs>
+          <w:tab w:val="num" w:pos="6480"/>
+        </w:tabs>
+        <w:ind w:left="6480" w:hanging="360"/>
+      </w:pPr>
+      <w:rPr>
+        <w:rFonts w:ascii="Wingdings" w:hAnsi="Wingdings" w:hint="default"/>
+        <w:sz w:val="20"/>
+      </w:rPr>
+    </w:lvl>
+  </w:abstractNum>
   <w:num w:numId="1">
-    <w:abstractNumId w:val="0"/>
+    <w:abstractNumId w:val="3"/>
   </w:num>
   <w:num w:numId="2">
-    <w:abstractNumId w:val="0"/>
+    <w:abstractNumId w:val="3"/>
     <w:lvlOverride w:ilvl="1">
       <w:lvl w:ilvl="1">
         <w:numFmt w:val="decimal"/>
@@ -577,7 +4112,7 @@
     </w:lvlOverride>
   </w:num>
   <w:num w:numId="3">
-    <w:abstractNumId w:val="0"/>
+    <w:abstractNumId w:val="3"/>
     <w:lvlOverride w:ilvl="1">
       <w:lvl w:ilvl="1">
         <w:numFmt w:val="bullet"/>
@@ -595,6 +4130,15 @@
         </w:rPr>
       </w:lvl>
     </w:lvlOverride>
+  </w:num>
+  <w:num w:numId="4">
+    <w:abstractNumId w:val="1"/>
+  </w:num>
+  <w:num w:numId="5">
+    <w:abstractNumId w:val="2"/>
+  </w:num>
+  <w:num w:numId="6">
+    <w:abstractNumId w:val="0"/>
   </w:num>
 </w:numbering>
 </file>
@@ -993,6 +4537,28 @@
     <w:name w:val="Normal"/>
     <w:qFormat/>
   </w:style>
+  <w:style w:type="paragraph" w:styleId="Titre1">
+    <w:name w:val="heading 1"/>
+    <w:basedOn w:val="Normal"/>
+    <w:next w:val="Normal"/>
+    <w:link w:val="Titre1Car"/>
+    <w:uiPriority w:val="9"/>
+    <w:qFormat/>
+    <w:rsid w:val="00706EE9"/>
+    <w:pPr>
+      <w:keepNext/>
+      <w:keepLines/>
+      <w:spacing w:before="240" w:after="0"/>
+      <w:ind w:left="1416"/>
+      <w:outlineLvl w:val="0"/>
+    </w:pPr>
+    <w:rPr>
+      <w:rFonts w:asciiTheme="majorHAnsi" w:eastAsiaTheme="majorEastAsia" w:hAnsiTheme="majorHAnsi" w:cstheme="majorBidi"/>
+      <w:color w:val="2E74B5" w:themeColor="accent1" w:themeShade="BF"/>
+      <w:sz w:val="40"/>
+      <w:szCs w:val="40"/>
+    </w:rPr>
+  </w:style>
   <w:style w:type="character" w:default="1" w:styleId="Policepardfaut">
     <w:name w:val="Default Paragraph Font"/>
     <w:uiPriority w:val="1"/>
@@ -1046,6 +4612,116 @@
     <w:rPr>
       <w:b/>
       <w:bCs/>
+    </w:rPr>
+  </w:style>
+  <w:style w:type="paragraph" w:styleId="Titre">
+    <w:name w:val="Title"/>
+    <w:basedOn w:val="Normal"/>
+    <w:next w:val="Normal"/>
+    <w:link w:val="TitreCar"/>
+    <w:uiPriority w:val="10"/>
+    <w:qFormat/>
+    <w:rsid w:val="00706EE9"/>
+    <w:pPr>
+      <w:spacing w:after="0" w:line="240" w:lineRule="auto"/>
+      <w:contextualSpacing/>
+    </w:pPr>
+    <w:rPr>
+      <w:rFonts w:asciiTheme="majorHAnsi" w:eastAsiaTheme="majorEastAsia" w:hAnsiTheme="majorHAnsi" w:cstheme="majorBidi"/>
+      <w:spacing w:val="-10"/>
+      <w:kern w:val="28"/>
+      <w:sz w:val="56"/>
+      <w:szCs w:val="56"/>
+    </w:rPr>
+  </w:style>
+  <w:style w:type="character" w:customStyle="1" w:styleId="TitreCar">
+    <w:name w:val="Titre Car"/>
+    <w:basedOn w:val="Policepardfaut"/>
+    <w:link w:val="Titre"/>
+    <w:uiPriority w:val="10"/>
+    <w:rsid w:val="00706EE9"/>
+    <w:rPr>
+      <w:rFonts w:asciiTheme="majorHAnsi" w:eastAsiaTheme="majorEastAsia" w:hAnsiTheme="majorHAnsi" w:cstheme="majorBidi"/>
+      <w:spacing w:val="-10"/>
+      <w:kern w:val="28"/>
+      <w:sz w:val="56"/>
+      <w:szCs w:val="56"/>
+    </w:rPr>
+  </w:style>
+  <w:style w:type="character" w:customStyle="1" w:styleId="Titre1Car">
+    <w:name w:val="Titre 1 Car"/>
+    <w:basedOn w:val="Policepardfaut"/>
+    <w:link w:val="Titre1"/>
+    <w:uiPriority w:val="9"/>
+    <w:rsid w:val="00706EE9"/>
+    <w:rPr>
+      <w:rFonts w:asciiTheme="majorHAnsi" w:eastAsiaTheme="majorEastAsia" w:hAnsiTheme="majorHAnsi" w:cstheme="majorBidi"/>
+      <w:color w:val="2E74B5" w:themeColor="accent1" w:themeShade="BF"/>
+      <w:sz w:val="40"/>
+      <w:szCs w:val="40"/>
+    </w:rPr>
+  </w:style>
+  <w:style w:type="character" w:styleId="CodeHTML">
+    <w:name w:val="HTML Code"/>
+    <w:basedOn w:val="Policepardfaut"/>
+    <w:uiPriority w:val="99"/>
+    <w:semiHidden/>
+    <w:unhideWhenUsed/>
+    <w:rsid w:val="00706EE9"/>
+    <w:rPr>
+      <w:rFonts w:ascii="Courier New" w:eastAsia="Times New Roman" w:hAnsi="Courier New" w:cs="Courier New"/>
+      <w:sz w:val="20"/>
+      <w:szCs w:val="20"/>
+    </w:rPr>
+  </w:style>
+  <w:style w:type="paragraph" w:styleId="PrformatHTML">
+    <w:name w:val="HTML Preformatted"/>
+    <w:basedOn w:val="Normal"/>
+    <w:link w:val="PrformatHTMLCar"/>
+    <w:uiPriority w:val="99"/>
+    <w:semiHidden/>
+    <w:unhideWhenUsed/>
+    <w:rsid w:val="00706EE9"/>
+    <w:pPr>
+      <w:tabs>
+        <w:tab w:val="left" w:pos="916"/>
+        <w:tab w:val="left" w:pos="1832"/>
+        <w:tab w:val="left" w:pos="2748"/>
+        <w:tab w:val="left" w:pos="3664"/>
+        <w:tab w:val="left" w:pos="4580"/>
+        <w:tab w:val="left" w:pos="5496"/>
+        <w:tab w:val="left" w:pos="6412"/>
+        <w:tab w:val="left" w:pos="7328"/>
+        <w:tab w:val="left" w:pos="8244"/>
+        <w:tab w:val="left" w:pos="9160"/>
+        <w:tab w:val="left" w:pos="10076"/>
+        <w:tab w:val="left" w:pos="10992"/>
+        <w:tab w:val="left" w:pos="11908"/>
+        <w:tab w:val="left" w:pos="12824"/>
+        <w:tab w:val="left" w:pos="13740"/>
+        <w:tab w:val="left" w:pos="14656"/>
+      </w:tabs>
+      <w:spacing w:after="0" w:line="240" w:lineRule="auto"/>
+    </w:pPr>
+    <w:rPr>
+      <w:rFonts w:ascii="Courier New" w:eastAsia="Times New Roman" w:hAnsi="Courier New" w:cs="Courier New"/>
+      <w:sz w:val="20"/>
+      <w:szCs w:val="20"/>
+      <w:lang w:eastAsia="fr-FR"/>
+    </w:rPr>
+  </w:style>
+  <w:style w:type="character" w:customStyle="1" w:styleId="PrformatHTMLCar">
+    <w:name w:val="Préformaté HTML Car"/>
+    <w:basedOn w:val="Policepardfaut"/>
+    <w:link w:val="PrformatHTML"/>
+    <w:uiPriority w:val="99"/>
+    <w:semiHidden/>
+    <w:rsid w:val="00706EE9"/>
+    <w:rPr>
+      <w:rFonts w:ascii="Courier New" w:eastAsia="Times New Roman" w:hAnsi="Courier New" w:cs="Courier New"/>
+      <w:sz w:val="20"/>
+      <w:szCs w:val="20"/>
+      <w:lang w:eastAsia="fr-FR"/>
     </w:rPr>
   </w:style>
 </w:styles>

</xml_diff>